<commit_message>
fix(exports): parse porcelain -z so spaced and non-ASCII paths are seen as dirty, and correct clone and docx wording [skip-ci]
</commit_message>
<xml_diff>
--- a/docs/scripts/generate_markdown_exports.docx
+++ b/docs/scripts/generate_markdown_exports.docx
@@ -26,7 +26,7 @@
         <w:t xml:space="preserve"> </w:t>
       </w:r>
       <w:r>
-        <w:t xml:space="preserve">2</w:t>
+        <w:t xml:space="preserve">3</w:t>
       </w:r>
       <w:r>
         <w:t xml:space="preserve"> </w:t>
@@ -42,7 +42,7 @@
         <w:t xml:space="preserve"> </w:t>
       </w:r>
       <w:r>
-        <w:t xml:space="preserve">2026-09-26T12:54:43Z</w:t>
+        <w:t xml:space="preserve">2026-09-26T13:27:53Z</w:t>
       </w:r>
       <w:r>
         <w:t xml:space="preserve"> </w:t>
@@ -1791,7 +1791,7 @@
         <w:t xml:space="preserve"> </w:t>
       </w:r>
       <w:r>
-        <w:t xml:space="preserve">stamp is a property of the source history, identical in every clone;</w:t>
+        <w:t xml:space="preserve">stamp is a property of the source history, identical in every FULL-history clone (a shallow clone stamps the boundary commit time);</w:t>
       </w:r>
     </w:p>
     <w:p>

</xml_diff>

<commit_message>
fix(exports): atomic same-directory install, structural twin healing, loud HTML-leg failure, provenance tags outside docs-chain-owned files [skip-ci]
</commit_message>
<xml_diff>
--- a/docs/scripts/generate_markdown_exports.docx
+++ b/docs/scripts/generate_markdown_exports.docx
@@ -2,7 +2,7 @@
 <file path=word/document.xml><?xml version="1.0" encoding="utf-8"?>
 <w:document xmlns:w="http://schemas.openxmlformats.org/wordprocessingml/2006/main" xmlns:m="http://schemas.openxmlformats.org/officeDocument/2006/math" xmlns:r="http://schemas.openxmlformats.org/officeDocument/2006/relationships" xmlns:o="urn:schemas-microsoft-com:office:office" xmlns:v="urn:schemas-microsoft-com:vml" xmlns:w10="urn:schemas-microsoft-com:office:word" xmlns:a="http://schemas.openxmlformats.org/drawingml/2006/main" xmlns:pic="http://schemas.openxmlformats.org/drawingml/2006/picture" xmlns:wp="http://schemas.openxmlformats.org/drawingml/2006/wordprocessingDrawing">
   <w:body>
-    <w:bookmarkStart w:id="26" w:name="Xafaee2ed11a9ab95be2d182c4cc3e65199b8395"/>
+    <w:bookmarkStart w:id="30" w:name="Xafaee2ed11a9ab95be2d182c4cc3e65199b8395"/>
     <w:p>
       <w:pPr>
         <w:pStyle w:val="Heading1"/>
@@ -26,7 +26,7 @@
         <w:t xml:space="preserve"> </w:t>
       </w:r>
       <w:r>
-        <w:t xml:space="preserve">3</w:t>
+        <w:t xml:space="preserve">5</w:t>
       </w:r>
       <w:r>
         <w:t xml:space="preserve"> </w:t>
@@ -42,7 +42,7 @@
         <w:t xml:space="preserve"> </w:t>
       </w:r>
       <w:r>
-        <w:t xml:space="preserve">2026-09-26T13:27:53Z</w:t>
+        <w:t xml:space="preserve">2026-09-26T14:26:37Z</w:t>
       </w:r>
       <w:r>
         <w:t xml:space="preserve"> </w:t>
@@ -701,7 +701,7 @@
       </w:r>
     </w:p>
     <w:bookmarkEnd w:id="10"/>
-    <w:bookmarkStart w:id="14" w:name="usage"/>
+    <w:bookmarkStart w:id="15" w:name="usage"/>
     <w:p>
       <w:pPr>
         <w:pStyle w:val="Heading2"/>
@@ -974,7 +974,202 @@
         <w:t xml:space="preserve"> </w:t>
       </w:r>
       <w:r>
-        <w:t xml:space="preserve">Counts of generated files are printed per twin type.</w:t>
+        <w:t xml:space="preserve">Per twin type the script prints how many were rendered, how many of those</w:t>
+      </w:r>
+      <w:r>
+        <w:t xml:space="preserve"> </w:t>
+      </w:r>
+      <w:r>
+        <w:t xml:space="preserve">were byte-identical to the existing twin (and therefore not rewritten), and</w:t>
+      </w:r>
+      <w:r>
+        <w:t xml:space="preserve"> </w:t>
+      </w:r>
+      <w:r>
+        <w:t xml:space="preserve">how many legs failed.</w:t>
+      </w:r>
+    </w:p>
+    <w:p>
+      <w:pPr>
+        <w:pStyle w:val="BodyText"/>
+      </w:pPr>
+      <w:r>
+        <w:t xml:space="preserve">Every leg renders into a private scratch directory first and only then</w:t>
+      </w:r>
+      <w:r>
+        <w:t xml:space="preserve"> </w:t>
+      </w:r>
+      <w:r>
+        <w:t xml:space="preserve">installs the result. The install never moves the render across filesystems</w:t>
+      </w:r>
+      <w:r>
+        <w:t xml:space="preserve"> </w:t>
+      </w:r>
+      <w:r>
+        <w:t xml:space="preserve">(the scratch directory can be tmpfs, where</w:t>
+      </w:r>
+      <w:r>
+        <w:t xml:space="preserve"> </w:t>
+      </w:r>
+      <w:r>
+        <w:rPr>
+          <w:rStyle w:val="VerbatimChar"/>
+        </w:rPr>
+        <w:t xml:space="preserve">mv</w:t>
+      </w:r>
+      <w:r>
+        <w:t xml:space="preserve"> </w:t>
+      </w:r>
+      <w:r>
+        <w:t xml:space="preserve">degrades to unlink + copy):</w:t>
+      </w:r>
+      <w:r>
+        <w:t xml:space="preserve"> </w:t>
+      </w:r>
+      <w:r>
+        <w:t xml:space="preserve">the bytes are copied to a temp file named</w:t>
+      </w:r>
+      <w:r>
+        <w:t xml:space="preserve"> </w:t>
+      </w:r>
+      <w:r>
+        <w:rPr>
+          <w:rStyle w:val="VerbatimChar"/>
+        </w:rPr>
+        <w:t xml:space="preserve">.&lt;twin&gt;.exporttmp.XXXXXX.tmp</w:t>
+      </w:r>
+      <w:r>
+        <w:t xml:space="preserve"> </w:t>
+      </w:r>
+      <w:r>
+        <w:t xml:space="preserve">in</w:t>
+      </w:r>
+      <w:r>
+        <w:t xml:space="preserve"> </w:t>
+      </w:r>
+      <w:r>
+        <w:t xml:space="preserve">the twin’s</w:t>
+      </w:r>
+      <w:r>
+        <w:t xml:space="preserve"> </w:t>
+      </w:r>
+      <w:r>
+        <w:rPr>
+          <w:b/>
+          <w:bCs/>
+        </w:rPr>
+        <w:t xml:space="preserve">own</w:t>
+      </w:r>
+      <w:r>
+        <w:t xml:space="preserve"> </w:t>
+      </w:r>
+      <w:r>
+        <w:t xml:space="preserve">directory, given the existing twin’s mode (or the umask</w:t>
+      </w:r>
+      <w:r>
+        <w:t xml:space="preserve"> </w:t>
+      </w:r>
+      <w:r>
+        <w:t xml:space="preserve">default for a new twin), and renamed over the twin with</w:t>
+      </w:r>
+      <w:r>
+        <w:t xml:space="preserve"> </w:t>
+      </w:r>
+      <w:r>
+        <w:rPr>
+          <w:rStyle w:val="VerbatimChar"/>
+        </w:rPr>
+        <w:t xml:space="preserve">mv -f</w:t>
+      </w:r>
+      <w:r>
+        <w:t xml:space="preserve"> </w:t>
+      </w:r>
+      <w:r>
+        <w:t xml:space="preserve">— an atomic</w:t>
+      </w:r>
+      <w:r>
+        <w:t xml:space="preserve"> </w:t>
+      </w:r>
+      <w:r>
+        <w:rPr>
+          <w:rStyle w:val="VerbatimChar"/>
+        </w:rPr>
+        <w:t xml:space="preserve">rename(2)</w:t>
+      </w:r>
+      <w:r>
+        <w:t xml:space="preserve">. A failed install removes the temp, leaves the previous twin</w:t>
+      </w:r>
+      <w:r>
+        <w:t xml:space="preserve"> </w:t>
+      </w:r>
+      <w:r>
+        <w:t xml:space="preserve">untouched, prints an</w:t>
+      </w:r>
+      <w:r>
+        <w:t xml:space="preserve"> </w:t>
+      </w:r>
+      <w:r>
+        <w:rPr>
+          <w:rStyle w:val="VerbatimChar"/>
+        </w:rPr>
+        <w:t xml:space="preserve">ERROR: could not install …</w:t>
+      </w:r>
+      <w:r>
+        <w:t xml:space="preserve"> </w:t>
+      </w:r>
+      <w:r>
+        <w:t xml:space="preserve">line and counts as a failed</w:t>
+      </w:r>
+      <w:r>
+        <w:t xml:space="preserve"> </w:t>
+      </w:r>
+      <w:r>
+        <w:t xml:space="preserve">leg (never as</w:t>
+      </w:r>
+      <w:r>
+        <w:t xml:space="preserve"> </w:t>
+      </w:r>
+      <w:r>
+        <w:t xml:space="preserve">“byte-identical”</w:t>
+      </w:r>
+      <w:r>
+        <w:t xml:space="preserve">). A temp left behind by a</w:t>
+      </w:r>
+      <w:r>
+        <w:t xml:space="preserve"> </w:t>
+      </w:r>
+      <w:r>
+        <w:rPr>
+          <w:rStyle w:val="VerbatimChar"/>
+        </w:rPr>
+        <w:t xml:space="preserve">SIGKILL</w:t>
+      </w:r>
+      <w:r>
+        <w:t xml:space="preserve"> </w:t>
+      </w:r>
+      <w:r>
+        <w:t xml:space="preserve">matches the</w:t>
+      </w:r>
+      <w:r>
+        <w:t xml:space="preserve"> </w:t>
+      </w:r>
+      <w:r>
+        <w:t xml:space="preserve">project’s</w:t>
+      </w:r>
+      <w:r>
+        <w:t xml:space="preserve"> </w:t>
+      </w:r>
+      <w:r>
+        <w:rPr>
+          <w:rStyle w:val="VerbatimChar"/>
+        </w:rPr>
+        <w:t xml:space="preserve">*.tmp</w:t>
+      </w:r>
+      <w:r>
+        <w:t xml:space="preserve"> </w:t>
+      </w:r>
+      <w:r>
+        <w:t xml:space="preserve">ignore rule and no twin pattern.</w:t>
       </w:r>
     </w:p>
     <w:bookmarkEnd w:id="12"/>
@@ -1119,101 +1314,55 @@
           </w:p>
         </w:tc>
       </w:tr>
+      <w:tr>
+        <w:tc>
+          <w:tcPr/>
+          <w:p>
+            <w:pPr>
+              <w:pStyle w:val="Compact"/>
+            </w:pPr>
+            <w:r>
+              <w:rPr>
+                <w:rStyle w:val="VerbatimChar"/>
+              </w:rPr>
+              <w:t xml:space="preserve">2</w:t>
+            </w:r>
+          </w:p>
+        </w:tc>
+        <w:tc>
+          <w:tcPr/>
+          <w:p>
+            <w:pPr>
+              <w:pStyle w:val="Compact"/>
+            </w:pPr>
+            <w:r>
+              <w:t xml:space="preserve">The run completed, but at least one HTML leg failed. Each failure is printed on stderr as an</w:t>
+            </w:r>
+            <w:r>
+              <w:t xml:space="preserve"> </w:t>
+            </w:r>
+            <w:r>
+              <w:rPr>
+                <w:rStyle w:val="VerbatimChar"/>
+              </w:rPr>
+              <w:t xml:space="preserve">ERROR:</w:t>
+            </w:r>
+            <w:r>
+              <w:t xml:space="preserve"> </w:t>
+            </w:r>
+            <w:r>
+              <w:t xml:space="preserve">line carrying the converter’s own message.</w:t>
+            </w:r>
+          </w:p>
+        </w:tc>
+      </w:tr>
     </w:tbl>
-    <w:bookmarkEnd w:id="13"/>
-    <w:bookmarkEnd w:id="14"/>
-    <w:bookmarkStart w:id="15" w:name="why-the-explicit-scope-argument-exists"/>
-    <w:p>
-      <w:pPr>
-        <w:pStyle w:val="Heading2"/>
-      </w:pPr>
-      <w:r>
-        <w:t xml:space="preserve">Why the explicit-scope argument exists</w:t>
-      </w:r>
-    </w:p>
-    <w:p>
-      <w:pPr>
-        <w:pStyle w:val="FirstParagraph"/>
-      </w:pPr>
-      <w:r>
-        <w:t xml:space="preserve">The full sweep touches ~355 exports. A session that edits nine documents</w:t>
-      </w:r>
-      <w:r>
-        <w:t xml:space="preserve"> </w:t>
-      </w:r>
-      <w:r>
-        <w:t xml:space="preserve">should resync exactly those nine twins: re-rendering 346 unrelated exports</w:t>
-      </w:r>
-      <w:r>
-        <w:t xml:space="preserve"> </w:t>
-      </w:r>
-      <w:r>
-        <w:t xml:space="preserve">costs minutes of</w:t>
-      </w:r>
-      <w:r>
-        <w:t xml:space="preserve"> </w:t>
-      </w:r>
-      <w:r>
-        <w:rPr>
-          <w:rStyle w:val="VerbatimChar"/>
-        </w:rPr>
-        <w:t xml:space="preserve">weasyprint</w:t>
-      </w:r>
-      <w:r>
-        <w:t xml:space="preserve"> </w:t>
-      </w:r>
-      <w:r>
-        <w:t xml:space="preserve">time and needlessly churns the corpus that</w:t>
-      </w:r>
-      <w:r>
-        <w:t xml:space="preserve"> </w:t>
-      </w:r>
-      <w:r>
-        <w:rPr>
-          <w:rStyle w:val="VerbatimChar"/>
-        </w:rPr>
-        <w:t xml:space="preserve">scripts/pre_build/check_cm_export_charset_valid.sh</w:t>
-      </w:r>
-      <w:r>
-        <w:t xml:space="preserve"> </w:t>
-      </w:r>
-      <w:r>
-        <w:t xml:space="preserve">measures against its</w:t>
-      </w:r>
-      <w:r>
-        <w:t xml:space="preserve"> </w:t>
-      </w:r>
-      <w:r>
-        <w:t xml:space="preserve">monotone ratchet baseline. Passing the changed files keeps the blast radius</w:t>
-      </w:r>
-      <w:r>
-        <w:t xml:space="preserve"> </w:t>
-      </w:r>
-      <w:r>
-        <w:t xml:space="preserve">equal to the change.</w:t>
-      </w:r>
-    </w:p>
     <w:p>
       <w:pPr>
         <w:pStyle w:val="BodyText"/>
       </w:pPr>
       <w:r>
-        <w:t xml:space="preserve">An argument that is not an existing</w:t>
-      </w:r>
-      <w:r>
-        <w:t xml:space="preserve"> </w:t>
-      </w:r>
-      <w:r>
-        <w:rPr>
-          <w:rStyle w:val="VerbatimChar"/>
-        </w:rPr>
-        <w:t xml:space="preserve">.md</w:t>
-      </w:r>
-      <w:r>
-        <w:t xml:space="preserve"> </w:t>
-      </w:r>
-      <w:r>
-        <w:t xml:space="preserve">file is a</w:t>
+        <w:t xml:space="preserve">A failed</w:t>
       </w:r>
       <w:r>
         <w:t xml:space="preserve"> </w:t>
@@ -1223,6 +1372,291 @@
           <w:b/>
           <w:bCs/>
         </w:rPr>
+        <w:t xml:space="preserve">PDF</w:t>
+      </w:r>
+      <w:r>
+        <w:t xml:space="preserve"> </w:t>
+      </w:r>
+      <w:r>
+        <w:t xml:space="preserve">or</w:t>
+      </w:r>
+      <w:r>
+        <w:t xml:space="preserve"> </w:t>
+      </w:r>
+      <w:r>
+        <w:rPr>
+          <w:b/>
+          <w:bCs/>
+        </w:rPr>
+        <w:t xml:space="preserve">DOCX</w:t>
+      </w:r>
+      <w:r>
+        <w:t xml:space="preserve"> </w:t>
+      </w:r>
+      <w:r>
+        <w:t xml:space="preserve">leg keeps its historical non-fatal status: it is</w:t>
+      </w:r>
+      <w:r>
+        <w:t xml:space="preserve"> </w:t>
+      </w:r>
+      <w:r>
+        <w:t xml:space="preserve">counted, reported as a</w:t>
+      </w:r>
+      <w:r>
+        <w:t xml:space="preserve"> </w:t>
+      </w:r>
+      <w:r>
+        <w:rPr>
+          <w:rStyle w:val="VerbatimChar"/>
+        </w:rPr>
+        <w:t xml:space="preserve">WARN:</w:t>
+      </w:r>
+      <w:r>
+        <w:t xml:space="preserve"> </w:t>
+      </w:r>
+      <w:r>
+        <w:t xml:space="preserve">line on stderr, and the previous twin (if any)</w:t>
+      </w:r>
+      <w:r>
+        <w:t xml:space="preserve"> </w:t>
+      </w:r>
+      <w:r>
+        <w:t xml:space="preserve">is left in place.</w:t>
+      </w:r>
+    </w:p>
+    <w:bookmarkEnd w:id="13"/>
+    <w:bookmarkStart w:id="14" w:name="a-failed-html-leg-bob-249-review-m4"/>
+    <w:p>
+      <w:pPr>
+        <w:pStyle w:val="Heading3"/>
+      </w:pPr>
+      <w:r>
+        <w:t xml:space="preserve">A failed HTML leg (BOB-249 review M4)</w:t>
+      </w:r>
+    </w:p>
+    <w:p>
+      <w:pPr>
+        <w:pStyle w:val="FirstParagraph"/>
+      </w:pPr>
+      <w:r>
+        <w:t xml:space="preserve">The HTML converter used to run bare under</w:t>
+      </w:r>
+      <w:r>
+        <w:t xml:space="preserve"> </w:t>
+      </w:r>
+      <w:r>
+        <w:rPr>
+          <w:rStyle w:val="VerbatimChar"/>
+        </w:rPr>
+        <w:t xml:space="preserve">set -e</w:t>
+      </w:r>
+      <w:r>
+        <w:t xml:space="preserve"> </w:t>
+      </w:r>
+      <w:r>
+        <w:t xml:space="preserve">with its stderr thrown</w:t>
+      </w:r>
+      <w:r>
+        <w:t xml:space="preserve"> </w:t>
+      </w:r>
+      <w:r>
+        <w:t xml:space="preserve">away. One failing render therefore aborted the whole run with no message at</w:t>
+      </w:r>
+      <w:r>
+        <w:t xml:space="preserve"> </w:t>
+      </w:r>
+      <w:r>
+        <w:t xml:space="preserve">all (measured: exit 3, the DOCX leg of the same file and every later file</w:t>
+      </w:r>
+      <w:r>
+        <w:t xml:space="preserve"> </w:t>
+      </w:r>
+      <w:r>
+        <w:t xml:space="preserve">never processed). Now the failure is caught and reported, the stale</w:t>
+      </w:r>
+      <w:r>
+        <w:t xml:space="preserve"> </w:t>
+      </w:r>
+      <w:r>
+        <w:rPr>
+          <w:rStyle w:val="VerbatimChar"/>
+        </w:rPr>
+        <w:t xml:space="preserve">.html</w:t>
+      </w:r>
+      <w:r>
+        <w:t xml:space="preserve"> </w:t>
+      </w:r>
+      <w:r>
+        <w:t xml:space="preserve">is left exactly as it was, the</w:t>
+      </w:r>
+      <w:r>
+        <w:t xml:space="preserve"> </w:t>
+      </w:r>
+      <w:r>
+        <w:rPr>
+          <w:rStyle w:val="VerbatimChar"/>
+        </w:rPr>
+        <w:t xml:space="preserve">.pdf</w:t>
+      </w:r>
+      <w:r>
+        <w:t xml:space="preserve"> </w:t>
+      </w:r>
+      <w:r>
+        <w:t xml:space="preserve">is</w:t>
+      </w:r>
+      <w:r>
+        <w:t xml:space="preserve"> </w:t>
+      </w:r>
+      <w:r>
+        <w:rPr>
+          <w:b/>
+          <w:bCs/>
+        </w:rPr>
+        <w:t xml:space="preserve">not</w:t>
+      </w:r>
+      <w:r>
+        <w:t xml:space="preserve"> </w:t>
+      </w:r>
+      <w:r>
+        <w:t xml:space="preserve">re-derived from that stale</w:t>
+      </w:r>
+      <w:r>
+        <w:t xml:space="preserve"> </w:t>
+      </w:r>
+      <w:r>
+        <w:rPr>
+          <w:rStyle w:val="VerbatimChar"/>
+        </w:rPr>
+        <w:t xml:space="preserve">.html</w:t>
+      </w:r>
+      <w:r>
+        <w:t xml:space="preserve"> </w:t>
+      </w:r>
+      <w:r>
+        <w:t xml:space="preserve">(a PDF baked from it would look fresh while carrying old content),</w:t>
+      </w:r>
+      <w:r>
+        <w:t xml:space="preserve"> </w:t>
+      </w:r>
+      <w:r>
+        <w:t xml:space="preserve">the DOCX leg and every remaining file still run, and the script exits</w:t>
+      </w:r>
+      <w:r>
+        <w:t xml:space="preserve"> </w:t>
+      </w:r>
+      <w:r>
+        <w:rPr>
+          <w:rStyle w:val="VerbatimChar"/>
+        </w:rPr>
+        <w:t xml:space="preserve">2</w:t>
+      </w:r>
+      <w:r>
+        <w:t xml:space="preserve">.</w:t>
+      </w:r>
+    </w:p>
+    <w:bookmarkEnd w:id="14"/>
+    <w:bookmarkEnd w:id="15"/>
+    <w:bookmarkStart w:id="16" w:name="why-the-explicit-scope-argument-exists"/>
+    <w:p>
+      <w:pPr>
+        <w:pStyle w:val="Heading2"/>
+      </w:pPr>
+      <w:r>
+        <w:t xml:space="preserve">Why the explicit-scope argument exists</w:t>
+      </w:r>
+    </w:p>
+    <w:p>
+      <w:pPr>
+        <w:pStyle w:val="FirstParagraph"/>
+      </w:pPr>
+      <w:r>
+        <w:t xml:space="preserve">The full sweep touches ~355 exports. A session that edits nine documents</w:t>
+      </w:r>
+      <w:r>
+        <w:t xml:space="preserve"> </w:t>
+      </w:r>
+      <w:r>
+        <w:t xml:space="preserve">should resync exactly those nine twins: re-rendering 346 unrelated exports</w:t>
+      </w:r>
+      <w:r>
+        <w:t xml:space="preserve"> </w:t>
+      </w:r>
+      <w:r>
+        <w:t xml:space="preserve">costs minutes of</w:t>
+      </w:r>
+      <w:r>
+        <w:t xml:space="preserve"> </w:t>
+      </w:r>
+      <w:r>
+        <w:rPr>
+          <w:rStyle w:val="VerbatimChar"/>
+        </w:rPr>
+        <w:t xml:space="preserve">weasyprint</w:t>
+      </w:r>
+      <w:r>
+        <w:t xml:space="preserve"> </w:t>
+      </w:r>
+      <w:r>
+        <w:t xml:space="preserve">time and needlessly churns the corpus that</w:t>
+      </w:r>
+      <w:r>
+        <w:t xml:space="preserve"> </w:t>
+      </w:r>
+      <w:r>
+        <w:rPr>
+          <w:rStyle w:val="VerbatimChar"/>
+        </w:rPr>
+        <w:t xml:space="preserve">scripts/pre_build/check_cm_export_charset_valid.sh</w:t>
+      </w:r>
+      <w:r>
+        <w:t xml:space="preserve"> </w:t>
+      </w:r>
+      <w:r>
+        <w:t xml:space="preserve">measures against its</w:t>
+      </w:r>
+      <w:r>
+        <w:t xml:space="preserve"> </w:t>
+      </w:r>
+      <w:r>
+        <w:t xml:space="preserve">monotone ratchet baseline. Passing the changed files keeps the blast radius</w:t>
+      </w:r>
+      <w:r>
+        <w:t xml:space="preserve"> </w:t>
+      </w:r>
+      <w:r>
+        <w:t xml:space="preserve">equal to the change.</w:t>
+      </w:r>
+    </w:p>
+    <w:p>
+      <w:pPr>
+        <w:pStyle w:val="BodyText"/>
+      </w:pPr>
+      <w:r>
+        <w:t xml:space="preserve">An argument that is not an existing</w:t>
+      </w:r>
+      <w:r>
+        <w:t xml:space="preserve"> </w:t>
+      </w:r>
+      <w:r>
+        <w:rPr>
+          <w:rStyle w:val="VerbatimChar"/>
+        </w:rPr>
+        <w:t xml:space="preserve">.md</w:t>
+      </w:r>
+      <w:r>
+        <w:t xml:space="preserve"> </w:t>
+      </w:r>
+      <w:r>
+        <w:t xml:space="preserve">file is a</w:t>
+      </w:r>
+      <w:r>
+        <w:t xml:space="preserve"> </w:t>
+      </w:r>
+      <w:r>
+        <w:rPr>
+          <w:b/>
+          <w:bCs/>
+        </w:rPr>
         <w:t xml:space="preserve">hard error</w:t>
       </w:r>
       <w:r>
@@ -1259,8 +1693,8 @@
         <w:t xml:space="preserve">from a clean corpus).</w:t>
       </w:r>
     </w:p>
-    <w:bookmarkEnd w:id="15"/>
-    <w:bookmarkStart w:id="19" w:name="idempotency-and-the-staleness-rule"/>
+    <w:bookmarkEnd w:id="16"/>
+    <w:bookmarkStart w:id="23" w:name="idempotency-and-the-staleness-rule"/>
     <w:p>
       <w:pPr>
         <w:pStyle w:val="Heading2"/>
@@ -1283,7 +1717,7 @@
         <w:t xml:space="preserve">and leaves every twin byte-identical.</w:t>
       </w:r>
     </w:p>
-    <w:bookmarkStart w:id="16" w:name="X01f1401d0fb5af2b42cb1e8cb9967a3eb1d492c"/>
+    <w:bookmarkStart w:id="17" w:name="X01f1401d0fb5af2b42cb1e8cb9967a3eb1d492c"/>
     <w:p>
       <w:pPr>
         <w:pStyle w:val="Heading3"/>
@@ -1686,8 +2120,8 @@
         <w:t xml:space="preserve">still regenerates all three twins.</w:t>
       </w:r>
     </w:p>
-    <w:bookmarkEnd w:id="16"/>
-    <w:bookmarkStart w:id="17" w:name="byte-stable-output-source_date_epoch"/>
+    <w:bookmarkEnd w:id="17"/>
+    <w:bookmarkStart w:id="18" w:name="byte-stable-output-source_date_epoch"/>
     <w:p>
       <w:pPr>
         <w:pStyle w:val="Heading3"/>
@@ -2005,14 +2439,14 @@
         <w:t xml:space="preserve">deterministic per (content, history), not per content alone.</w:t>
       </w:r>
     </w:p>
-    <w:bookmarkEnd w:id="17"/>
-    <w:bookmarkStart w:id="18" w:name="the-charset-self-heal-rule"/>
+    <w:bookmarkEnd w:id="18"/>
+    <w:bookmarkStart w:id="19" w:name="X5442e8f923a579cd1347ed76b7c166fac210ce8"/>
     <w:p>
       <w:pPr>
         <w:pStyle w:val="Heading3"/>
       </w:pPr>
       <w:r>
-        <w:t xml:space="preserve">The charset self-heal rule</w:t>
+        <w:t xml:space="preserve">Identical renders are not rewritten, and HTML records its provenance (BOB-249 review M1)</w:t>
       </w:r>
     </w:p>
     <w:p>
@@ -2020,7 +2454,7 @@
         <w:pStyle w:val="FirstParagraph"/>
       </w:pPr>
       <w:r>
-        <w:t xml:space="preserve">Staleness is</w:t>
+        <w:t xml:space="preserve">Two rules together make a stale pair</w:t>
       </w:r>
       <w:r>
         <w:t xml:space="preserve"> </w:t>
@@ -2030,851 +2464,19 @@
           <w:b/>
           <w:bCs/>
         </w:rPr>
-        <w:t xml:space="preserve">not</w:t>
-      </w:r>
-      <w:r>
-        <w:t xml:space="preserve"> </w:t>
-      </w:r>
-      <w:r>
-        <w:t xml:space="preserve">history alone. An</w:t>
-      </w:r>
-      <w:r>
-        <w:t xml:space="preserve"> </w:t>
-      </w:r>
-      <w:r>
-        <w:rPr>
-          <w:rStyle w:val="VerbatimChar"/>
-        </w:rPr>
-        <w:t xml:space="preserve">.html</w:t>
-      </w:r>
-      <w:r>
-        <w:t xml:space="preserve"> </w:t>
-      </w:r>
-      <w:r>
-        <w:t xml:space="preserve">that exists and is mtime-fresh</w:t>
-      </w:r>
-      <w:r>
-        <w:t xml:space="preserve"> </w:t>
-      </w:r>
-      <w:r>
-        <w:t xml:space="preserve">but declares</w:t>
-      </w:r>
-      <w:r>
-        <w:t xml:space="preserve"> </w:t>
-      </w:r>
-      <w:r>
-        <w:rPr>
-          <w:b/>
-          <w:bCs/>
-        </w:rPr>
-        <w:t xml:space="preserve">no charset</w:t>
-      </w:r>
-      <w:r>
-        <w:t xml:space="preserve"> </w:t>
-      </w:r>
-      <w:r>
-        <w:t xml:space="preserve">is treated as STALE and regenerated, because such</w:t>
-      </w:r>
-      <w:r>
-        <w:t xml:space="preserve"> </w:t>
-      </w:r>
-      <w:r>
-        <w:t xml:space="preserve">a file is a pre-BOB-169 charset-less fragment that would otherwise persist</w:t>
-      </w:r>
-      <w:r>
-        <w:t xml:space="preserve"> </w:t>
-      </w:r>
-      <w:r>
-        <w:t xml:space="preserve">forever and keep re-baking mojibake into any PDF rendered from it. PDF</w:t>
-      </w:r>
-      <w:r>
-        <w:t xml:space="preserve"> </w:t>
-      </w:r>
-      <w:r>
-        <w:t xml:space="preserve">staleness additionally keys on the</w:t>
-      </w:r>
-      <w:r>
-        <w:t xml:space="preserve"> </w:t>
-      </w:r>
-      <w:r>
-        <w:rPr>
-          <w:rStyle w:val="VerbatimChar"/>
-        </w:rPr>
-        <w:t xml:space="preserve">.html</w:t>
-      </w:r>
-      <w:r>
-        <w:t xml:space="preserve"> </w:t>
-      </w:r>
-      <w:r>
-        <w:t xml:space="preserve">(the PDF is derived from it), so</w:t>
-      </w:r>
-      <w:r>
-        <w:t xml:space="preserve"> </w:t>
-      </w:r>
-      <w:r>
-        <w:t xml:space="preserve">healing the HTML half cannot leave a corrupt PDF behind. An HTML regenerated</w:t>
-      </w:r>
-      <w:r>
-        <w:t xml:space="preserve"> </w:t>
-      </w:r>
-      <w:r>
-        <w:t xml:space="preserve">in the</w:t>
-      </w:r>
-      <w:r>
-        <w:t xml:space="preserve"> </w:t>
-      </w:r>
-      <w:r>
-        <w:rPr>
-          <w:b/>
-          <w:bCs/>
-        </w:rPr>
-        <w:t xml:space="preserve">current</w:t>
-      </w:r>
-      <w:r>
-        <w:t xml:space="preserve"> </w:t>
-      </w:r>
-      <w:r>
-        <w:t xml:space="preserve">run always re-derives its PDF explicitly: the oracle caches</w:t>
-      </w:r>
-      <w:r>
-        <w:t xml:space="preserve"> </w:t>
-      </w:r>
-      <w:r>
-        <w:t xml:space="preserve">the working-tree state once per run, so to it a just-rewritten HTML still</w:t>
-      </w:r>
-      <w:r>
-        <w:t xml:space="preserve"> </w:t>
-      </w:r>
-      <w:r>
-        <w:t xml:space="preserve">looks clean.</w:t>
-      </w:r>
-    </w:p>
-    <w:bookmarkEnd w:id="18"/>
-    <w:bookmarkEnd w:id="19"/>
-    <w:bookmarkStart w:id="23" w:name="internal-behaviour-worth-knowing"/>
-    <w:p>
-      <w:pPr>
-        <w:pStyle w:val="Heading2"/>
-      </w:pPr>
-      <w:r>
-        <w:t xml:space="preserve">Internal behaviour worth knowing</w:t>
-      </w:r>
-    </w:p>
-    <w:bookmarkStart w:id="20" w:name="X03819369ec2a8a1fe3823a5b41788a4e699a903"/>
-    <w:p>
-      <w:pPr>
-        <w:pStyle w:val="Heading3"/>
-      </w:pPr>
-      <w:r>
-        <w:t xml:space="preserve">Capability probes test the artifact, not a prerequisite</w:t>
-      </w:r>
-    </w:p>
-    <w:p>
-      <w:pPr>
-        <w:pStyle w:val="FirstParagraph"/>
-      </w:pPr>
-      <w:r>
-        <w:t xml:space="preserve">The weasyprint probe runs</w:t>
-      </w:r>
-      <w:r>
-        <w:t xml:space="preserve"> </w:t>
-      </w:r>
-      <w:r>
-        <w:rPr>
-          <w:rStyle w:val="VerbatimChar"/>
-        </w:rPr>
-        <w:t xml:space="preserve">weasyprint --version</w:t>
-      </w:r>
-      <w:r>
-        <w:t xml:space="preserve"> </w:t>
-      </w:r>
-      <w:r>
-        <w:t xml:space="preserve">— the real entry point the</w:t>
-      </w:r>
-      <w:r>
-        <w:t xml:space="preserve"> </w:t>
-      </w:r>
-      <w:r>
-        <w:t xml:space="preserve">render path uses. It previously also required</w:t>
-      </w:r>
-      <w:r>
-        <w:t xml:space="preserve"> </w:t>
-      </w:r>
-      <w:r>
-        <w:rPr>
-          <w:rStyle w:val="VerbatimChar"/>
-        </w:rPr>
-        <w:t xml:space="preserve">python3 -c "from weasyprint import HTML"</w:t>
-      </w:r>
-      <w:r>
-        <w:t xml:space="preserve"> </w:t>
-      </w:r>
-      <w:r>
-        <w:t xml:space="preserve">to succeed, which is a</w:t>
-      </w:r>
-      <w:r>
-        <w:t xml:space="preserve"> </w:t>
-      </w:r>
-      <w:r>
-        <w:rPr>
-          <w:b/>
-          <w:bCs/>
-        </w:rPr>
-        <w:t xml:space="preserve">prerequisite</w:t>
-      </w:r>
-      <w:r>
-        <w:t xml:space="preserve"> </w:t>
-      </w:r>
-      <w:r>
-        <w:t xml:space="preserve">probe, not an artifact probe: a</w:t>
-      </w:r>
-      <w:r>
-        <w:t xml:space="preserve"> </w:t>
-      </w:r>
-      <w:r>
-        <w:rPr>
-          <w:rStyle w:val="VerbatimChar"/>
-        </w:rPr>
-        <w:t xml:space="preserve">weasyprint</w:t>
-      </w:r>
-      <w:r>
-        <w:t xml:space="preserve"> </w:t>
-      </w:r>
-      <w:r>
-        <w:t xml:space="preserve">CLI installed</w:t>
-      </w:r>
-      <w:r>
-        <w:t xml:space="preserve"> </w:t>
-      </w:r>
-      <w:r>
-        <w:t xml:space="preserve">into its own isolated environment (</w:t>
-      </w:r>
-      <w:r>
-        <w:rPr>
-          <w:rStyle w:val="VerbatimChar"/>
-        </w:rPr>
-        <w:t xml:space="preserve">uv tool install</w:t>
-      </w:r>
-      <w:r>
-        <w:t xml:space="preserve">,</w:t>
-      </w:r>
-      <w:r>
-        <w:t xml:space="preserve"> </w:t>
-      </w:r>
-      <w:r>
-        <w:rPr>
-          <w:rStyle w:val="VerbatimChar"/>
-        </w:rPr>
-        <w:t xml:space="preserve">pipx</w:t>
-      </w:r>
-      <w:r>
-        <w:t xml:space="preserve">, a venv on</w:t>
-      </w:r>
-      <w:r>
-        <w:t xml:space="preserve"> </w:t>
-      </w:r>
-      <w:r>
-        <w:rPr>
-          <w:rStyle w:val="VerbatimChar"/>
-        </w:rPr>
-        <w:t xml:space="preserve">PATH</w:t>
-      </w:r>
-      <w:r>
-        <w:t xml:space="preserve">) renders PDFs perfectly while being invisible to a system-interpreter</w:t>
-      </w:r>
-      <w:r>
-        <w:t xml:space="preserve"> </w:t>
-      </w:r>
-      <w:r>
-        <w:t xml:space="preserve">import. On this host that made the script announce</w:t>
-      </w:r>
-      <w:r>
-        <w:t xml:space="preserve"> </w:t>
-      </w:r>
-      <w:r>
-        <w:rPr>
-          <w:i/>
-          <w:iCs/>
-        </w:rPr>
-        <w:t xml:space="preserve">“PDF support: not</w:t>
-      </w:r>
-      <w:r>
-        <w:rPr>
-          <w:i/>
-          <w:iCs/>
-        </w:rPr>
-        <w:t xml:space="preserve"> </w:t>
-      </w:r>
-      <w:r>
-        <w:rPr>
-          <w:i/>
-          <w:iCs/>
-        </w:rPr>
-        <w:t xml:space="preserve">available”</w:t>
-      </w:r>
-      <w:r>
-        <w:t xml:space="preserve"> </w:t>
-      </w:r>
-      <w:r>
-        <w:t xml:space="preserve">and produce</w:t>
-      </w:r>
-      <w:r>
-        <w:t xml:space="preserve"> </w:t>
-      </w:r>
-      <w:r>
-        <w:rPr>
-          <w:b/>
-          <w:bCs/>
-        </w:rPr>
-        <w:t xml:space="preserve">zero PDFs while exiting 0</w:t>
-      </w:r>
-      <w:r>
-        <w:t xml:space="preserve"> </w:t>
-      </w:r>
-      <w:r>
-        <w:t xml:space="preserve">— a false negative of</w:t>
-      </w:r>
-      <w:r>
-        <w:t xml:space="preserve"> </w:t>
-      </w:r>
-      <w:r>
-        <w:t xml:space="preserve">exactly the shape §11.4.201(11) names. Do not reintroduce an import-based</w:t>
-      </w:r>
-      <w:r>
-        <w:t xml:space="preserve"> </w:t>
-      </w:r>
-      <w:r>
-        <w:t xml:space="preserve">probe for a CLI-invoked tool.</w:t>
-      </w:r>
-    </w:p>
-    <w:bookmarkEnd w:id="20"/>
-    <w:bookmarkStart w:id="21" w:name="X00dbfa4b3b89e64c71d4e409204261ff8ef0921"/>
-    <w:p>
-      <w:pPr>
-        <w:pStyle w:val="Heading3"/>
-      </w:pPr>
-      <w:r>
-        <w:t xml:space="preserve">The python-markdown interpreter is resolved by trying the import</w:t>
-      </w:r>
-    </w:p>
-    <w:p>
-      <w:pPr>
-        <w:pStyle w:val="FirstParagraph"/>
-      </w:pPr>
-      <w:r>
-        <w:rPr>
-          <w:rStyle w:val="VerbatimChar"/>
-        </w:rPr>
-        <w:t xml:space="preserve">PY_MD</w:t>
-      </w:r>
-      <w:r>
-        <w:t xml:space="preserve"> </w:t>
-      </w:r>
-      <w:r>
-        <w:t xml:space="preserve">is chosen by actually attempting</w:t>
-      </w:r>
-      <w:r>
-        <w:t xml:space="preserve"> </w:t>
-      </w:r>
-      <w:r>
-        <w:rPr>
-          <w:rStyle w:val="VerbatimChar"/>
-        </w:rPr>
-        <w:t xml:space="preserve">import markdown</w:t>
-      </w:r>
-      <w:r>
-        <w:t xml:space="preserve"> </w:t>
-      </w:r>
-      <w:r>
-        <w:t xml:space="preserve">against, in order:</w:t>
-      </w:r>
-      <w:r>
-        <w:t xml:space="preserve"> </w:t>
-      </w:r>
-      <w:r>
-        <w:rPr>
-          <w:rStyle w:val="VerbatimChar"/>
-        </w:rPr>
-        <w:t xml:space="preserve">$BOBA_EXPORT_PYTHON</w:t>
-      </w:r>
-      <w:r>
-        <w:t xml:space="preserve">, the repo’s</w:t>
-      </w:r>
-      <w:r>
-        <w:t xml:space="preserve"> </w:t>
-      </w:r>
-      <w:r>
-        <w:rPr>
-          <w:rStyle w:val="VerbatimChar"/>
-        </w:rPr>
-        <w:t xml:space="preserve">.venv/bin/python</w:t>
-      </w:r>
-      <w:r>
-        <w:t xml:space="preserve">, then</w:t>
-      </w:r>
-      <w:r>
-        <w:t xml:space="preserve"> </w:t>
-      </w:r>
-      <w:r>
-        <w:rPr>
-          <w:rStyle w:val="VerbatimChar"/>
-        </w:rPr>
-        <w:t xml:space="preserve">python3</w:t>
-      </w:r>
-      <w:r>
-        <w:t xml:space="preserve">. It is</w:t>
-      </w:r>
-      <w:r>
-        <w:t xml:space="preserve"> </w:t>
-      </w:r>
-      <w:r>
-        <w:t xml:space="preserve">never assumed from a path’s existence (§11.4.6). Probing only system</w:t>
-      </w:r>
-      <w:r>
-        <w:t xml:space="preserve"> </w:t>
-      </w:r>
-      <w:r>
-        <w:rPr>
-          <w:rStyle w:val="VerbatimChar"/>
-        </w:rPr>
-        <w:t xml:space="preserve">python3</w:t>
-      </w:r>
-      <w:r>
-        <w:t xml:space="preserve"> </w:t>
-      </w:r>
-      <w:r>
-        <w:t xml:space="preserve">is insufficient here: this host’s</w:t>
-      </w:r>
-      <w:r>
-        <w:t xml:space="preserve"> </w:t>
-      </w:r>
-      <w:r>
-        <w:rPr>
-          <w:rStyle w:val="VerbatimChar"/>
-        </w:rPr>
-        <w:t xml:space="preserve">/usr/bin/python3</w:t>
-      </w:r>
-      <w:r>
-        <w:t xml:space="preserve"> </w:t>
-      </w:r>
-      <w:r>
-        <w:t xml:space="preserve">has no</w:t>
-      </w:r>
-      <w:r>
-        <w:t xml:space="preserve"> </w:t>
-      </w:r>
-      <w:r>
-        <w:rPr>
-          <w:rStyle w:val="VerbatimChar"/>
-        </w:rPr>
-        <w:t xml:space="preserve">pip</w:t>
-      </w:r>
-      <w:r>
-        <w:t xml:space="preserve"> </w:t>
-      </w:r>
-      <w:r>
-        <w:t xml:space="preserve">and is PEP-668</w:t>
-      </w:r>
-      <w:r>
-        <w:t xml:space="preserve"> </w:t>
-      </w:r>
-      <w:r>
-        <w:rPr>
-          <w:rStyle w:val="VerbatimChar"/>
-        </w:rPr>
-        <w:t xml:space="preserve">EXTERNALLY-MANAGED</w:t>
-      </w:r>
-      <w:r>
-        <w:t xml:space="preserve">, so</w:t>
-      </w:r>
-      <w:r>
-        <w:t xml:space="preserve"> </w:t>
-      </w:r>
-      <w:r>
-        <w:rPr>
-          <w:rStyle w:val="VerbatimChar"/>
-        </w:rPr>
-        <w:t xml:space="preserve">markdown</w:t>
-      </w:r>
-      <w:r>
-        <w:t xml:space="preserve"> </w:t>
-      </w:r>
-      <w:r>
-        <w:t xml:space="preserve">cannot live there without</w:t>
-      </w:r>
-      <w:r>
-        <w:t xml:space="preserve"> </w:t>
-      </w:r>
-      <w:r>
-        <w:t xml:space="preserve">root — while the repo</w:t>
-      </w:r>
-      <w:r>
-        <w:t xml:space="preserve"> </w:t>
-      </w:r>
-      <w:r>
-        <w:rPr>
-          <w:rStyle w:val="VerbatimChar"/>
-        </w:rPr>
-        <w:t xml:space="preserve">.venv</w:t>
-      </w:r>
-      <w:r>
-        <w:t xml:space="preserve"> </w:t>
-      </w:r>
-      <w:r>
-        <w:t xml:space="preserve">holds it with no privilege at all.</w:t>
-      </w:r>
-    </w:p>
-    <w:bookmarkEnd w:id="21"/>
-    <w:bookmarkStart w:id="22" w:name="encoding-is-pinned-on-both-legs"/>
-    <w:p>
-      <w:pPr>
-        <w:pStyle w:val="Heading3"/>
-      </w:pPr>
-      <w:r>
-        <w:t xml:space="preserve">Encoding is pinned on both legs</w:t>
-      </w:r>
-    </w:p>
-    <w:p>
-      <w:pPr>
-        <w:pStyle w:val="FirstParagraph"/>
-      </w:pPr>
-      <w:r>
-        <w:t xml:space="preserve">The corpus carries Cyrillic (</w:t>
-      </w:r>
-      <w:r>
-        <w:rPr>
-          <w:rStyle w:val="VerbatimChar"/>
-        </w:rPr>
-        <w:t xml:space="preserve">Боба</w:t>
-      </w:r>
-      <w:r>
-        <w:t xml:space="preserve">) and</w:t>
-      </w:r>
-      <w:r>
-        <w:t xml:space="preserve"> </w:t>
-      </w:r>
-      <w:r>
-        <w:rPr>
-          <w:rStyle w:val="VerbatimChar"/>
-        </w:rPr>
-        <w:t xml:space="preserve">§</w:t>
-      </w:r>
-      <w:r>
-        <w:t xml:space="preserve">. The python-markdown leg opens</w:t>
-      </w:r>
-      <w:r>
-        <w:t xml:space="preserve"> </w:t>
-      </w:r>
-      <w:r>
-        <w:t xml:space="preserve">and writes with an explicit</w:t>
-      </w:r>
-      <w:r>
-        <w:t xml:space="preserve"> </w:t>
-      </w:r>
-      <w:r>
-        <w:rPr>
-          <w:rStyle w:val="VerbatimChar"/>
-        </w:rPr>
-        <w:t xml:space="preserve">encoding='utf-8'</w:t>
-      </w:r>
-      <w:r>
-        <w:t xml:space="preserve"> </w:t>
-      </w:r>
-      <w:r>
-        <w:t xml:space="preserve">rather than inheriting the</w:t>
-      </w:r>
-      <w:r>
-        <w:t xml:space="preserve"> </w:t>
-      </w:r>
-      <w:r>
-        <w:t xml:space="preserve">ambient locale, so a</w:t>
-      </w:r>
-      <w:r>
-        <w:t xml:space="preserve"> </w:t>
-      </w:r>
-      <w:r>
-        <w:rPr>
-          <w:rStyle w:val="VerbatimChar"/>
-        </w:rPr>
-        <w:t xml:space="preserve">C</w:t>
-      </w:r>
-      <w:r>
-        <w:t xml:space="preserve">/</w:t>
-      </w:r>
-      <w:r>
-        <w:rPr>
-          <w:rStyle w:val="VerbatimChar"/>
-        </w:rPr>
-        <w:t xml:space="preserve">POSIX</w:t>
-      </w:r>
-      <w:r>
-        <w:t xml:space="preserve"> </w:t>
-      </w:r>
-      <w:r>
-        <w:t xml:space="preserve">locale cannot mangle the read and leave the</w:t>
-      </w:r>
-      <w:r>
-        <w:t xml:space="preserve"> </w:t>
-      </w:r>
-      <w:r>
-        <w:t xml:space="preserve">emitted</w:t>
-      </w:r>
-      <w:r>
-        <w:t xml:space="preserve"> </w:t>
-      </w:r>
-      <w:r>
-        <w:rPr>
-          <w:rStyle w:val="VerbatimChar"/>
-        </w:rPr>
-        <w:t xml:space="preserve">&lt;meta charset="utf-8"&gt;</w:t>
-      </w:r>
-      <w:r>
-        <w:t xml:space="preserve"> </w:t>
-      </w:r>
-      <w:r>
-        <w:t xml:space="preserve">advertising a lie.</w:t>
-      </w:r>
-    </w:p>
-    <w:bookmarkEnd w:id="22"/>
-    <w:bookmarkEnd w:id="23"/>
-    <w:bookmarkStart w:id="24" w:name="verifying-the-output"/>
-    <w:p>
-      <w:pPr>
-        <w:pStyle w:val="Heading2"/>
-      </w:pPr>
-      <w:r>
-        <w:t xml:space="preserve">Verifying the output</w:t>
-      </w:r>
-    </w:p>
-    <w:p>
-      <w:pPr>
-        <w:pStyle w:val="SourceCode"/>
-      </w:pPr>
-      <w:r>
-        <w:rPr>
-          <w:rStyle w:val="CommentTok"/>
-        </w:rPr>
-        <w:t xml:space="preserve"># charset declared on every generated export (ratcheted gate)</w:t>
-      </w:r>
-      <w:r>
-        <w:br/>
-      </w:r>
-      <w:r>
-        <w:rPr>
-          <w:rStyle w:val="FunctionTok"/>
-        </w:rPr>
-        <w:t xml:space="preserve">bash</w:t>
-      </w:r>
-      <w:r>
-        <w:rPr>
-          <w:rStyle w:val="NormalTok"/>
-        </w:rPr>
-        <w:t xml:space="preserve"> scripts/pre_build/check_cm_export_charset_valid.sh</w:t>
-      </w:r>
-      <w:r>
-        <w:br/>
-      </w:r>
-      <w:r>
-        <w:br/>
-      </w:r>
-      <w:r>
-        <w:rPr>
-          <w:rStyle w:val="CommentTok"/>
-        </w:rPr>
-        <w:t xml:space="preserve"># the PDF text layer really preserves non-ASCII</w:t>
-      </w:r>
-      <w:r>
-        <w:br/>
-      </w:r>
-      <w:r>
-        <w:rPr>
-          <w:rStyle w:val="FunctionTok"/>
-        </w:rPr>
-        <w:t xml:space="preserve">bash</w:t>
-      </w:r>
-      <w:r>
-        <w:rPr>
-          <w:rStyle w:val="NormalTok"/>
-        </w:rPr>
-        <w:t xml:space="preserve"> tests/unit/test_export_pdf_charset_integrity.sh</w:t>
-      </w:r>
-      <w:r>
-        <w:br/>
-      </w:r>
-      <w:r>
-        <w:br/>
-      </w:r>
-      <w:r>
-        <w:rPr>
-          <w:rStyle w:val="CommentTok"/>
-        </w:rPr>
-        <w:t xml:space="preserve"># DOCX shape + idempotency</w:t>
-      </w:r>
-      <w:r>
-        <w:br/>
-      </w:r>
-      <w:r>
-        <w:rPr>
-          <w:rStyle w:val="FunctionTok"/>
-        </w:rPr>
-        <w:t xml:space="preserve">bash</w:t>
-      </w:r>
-      <w:r>
-        <w:rPr>
-          <w:rStyle w:val="NormalTok"/>
-        </w:rPr>
-        <w:t xml:space="preserve"> tests/unit/test_docx_export.sh</w:t>
-      </w:r>
-      <w:r>
-        <w:br/>
-      </w:r>
-      <w:r>
-        <w:br/>
-      </w:r>
-      <w:r>
-        <w:rPr>
-          <w:rStyle w:val="CommentTok"/>
-        </w:rPr>
-        <w:t xml:space="preserve"># checkout-order touch rewrites nothing; content edit / missing twin /</w:t>
-      </w:r>
-      <w:r>
-        <w:br/>
-      </w:r>
-      <w:r>
-        <w:rPr>
-          <w:rStyle w:val="CommentTok"/>
-        </w:rPr>
-        <w:t xml:space="preserve"># charset fragment still regenerate; docx + pdf byte-stable</w:t>
-      </w:r>
-      <w:r>
-        <w:br/>
-      </w:r>
-      <w:r>
-        <w:rPr>
-          <w:rStyle w:val="FunctionTok"/>
-        </w:rPr>
-        <w:t xml:space="preserve">bash</w:t>
-      </w:r>
-      <w:r>
-        <w:rPr>
-          <w:rStyle w:val="NormalTok"/>
-        </w:rPr>
-        <w:t xml:space="preserve"> tests/unit/test_generate_markdown_exports_content_staleness.sh</w:t>
-      </w:r>
-      <w:r>
-        <w:br/>
-      </w:r>
-      <w:r>
-        <w:br/>
-      </w:r>
-      <w:r>
-        <w:rPr>
-          <w:rStyle w:val="CommentTok"/>
-        </w:rPr>
-        <w:t xml:space="preserve"># the shared staleness oracle (incl. .docx history)</w:t>
-      </w:r>
-      <w:r>
-        <w:br/>
-      </w:r>
-      <w:r>
-        <w:rPr>
-          <w:rStyle w:val="FunctionTok"/>
-        </w:rPr>
-        <w:t xml:space="preserve">bash</w:t>
-      </w:r>
-      <w:r>
-        <w:rPr>
-          <w:rStyle w:val="NormalTok"/>
-        </w:rPr>
-        <w:t xml:space="preserve"> tests/unit/test_export_staleness_oracle.sh</w:t>
-      </w:r>
-    </w:p>
-    <w:p>
-      <w:pPr>
-        <w:pStyle w:val="FirstParagraph"/>
-      </w:pPr>
-      <w:r>
-        <w:t xml:space="preserve">When checking a heading survived into the HTML, match against a</w:t>
-      </w:r>
-      <w:r>
-        <w:t xml:space="preserve"> </w:t>
-      </w:r>
-      <w:r>
-        <w:rPr>
-          <w:b/>
-          <w:bCs/>
-        </w:rPr>
-        <w:t xml:space="preserve">whitespace-normalized</w:t>
-      </w:r>
-      <w:r>
-        <w:t xml:space="preserve"> </w:t>
-      </w:r>
-      <w:r>
-        <w:t xml:space="preserve">stream, not lines: pandoc hard-wraps its HTML at</w:t>
-      </w:r>
-      <w:r>
-        <w:t xml:space="preserve"> </w:t>
-      </w:r>
-      <w:r>
-        <w:t xml:space="preserve">~72 columns, so a heading routinely spans a newline and a line-oriented</w:t>
-      </w:r>
-      <w:r>
-        <w:t xml:space="preserve"> </w:t>
-      </w:r>
-      <w:r>
-        <w:rPr>
-          <w:rStyle w:val="VerbatimChar"/>
-        </w:rPr>
-        <w:t xml:space="preserve">grep -F</w:t>
-      </w:r>
-      <w:r>
-        <w:t xml:space="preserve"> </w:t>
-      </w:r>
-      <w:r>
-        <w:t xml:space="preserve">returns a confident, wrong zero (§11.4.201(7)(c)). Remember also</w:t>
-      </w:r>
-      <w:r>
-        <w:t xml:space="preserve"> </w:t>
-      </w:r>
-      <w:r>
-        <w:t xml:space="preserve">that</w:t>
-      </w:r>
-      <w:r>
-        <w:t xml:space="preserve"> </w:t>
-      </w:r>
-      <w:r>
-        <w:rPr>
-          <w:rStyle w:val="VerbatimChar"/>
-        </w:rPr>
-        <w:t xml:space="preserve">&amp;</w:t>
-      </w:r>
-      <w:r>
-        <w:t xml:space="preserve"> </w:t>
-      </w:r>
-      <w:r>
-        <w:t xml:space="preserve">is correctly emitted as</w:t>
-      </w:r>
-      <w:r>
-        <w:t xml:space="preserve"> </w:t>
-      </w:r>
-      <w:r>
-        <w:rPr>
-          <w:rStyle w:val="VerbatimChar"/>
-        </w:rPr>
-        <w:t xml:space="preserve">&amp;amp;</w:t>
-      </w:r>
-      <w:r>
-        <w:t xml:space="preserve">.</w:t>
-      </w:r>
-    </w:p>
-    <w:bookmarkEnd w:id="24"/>
-    <w:bookmarkStart w:id="25" w:name="related-scripts"/>
-    <w:p>
-      <w:pPr>
-        <w:pStyle w:val="Heading2"/>
-      </w:pPr>
-      <w:r>
-        <w:t xml:space="preserve">Related scripts</w:t>
+        <w:t xml:space="preserve">converge</w:t>
+      </w:r>
+      <w:r>
+        <w:t xml:space="preserve"> </w:t>
+      </w:r>
+      <w:r>
+        <w:t xml:space="preserve">instead of staying stale</w:t>
+      </w:r>
+      <w:r>
+        <w:t xml:space="preserve"> </w:t>
+      </w:r>
+      <w:r>
+        <w:t xml:space="preserve">forever:</w:t>
       </w:r>
     </w:p>
     <w:p>
@@ -2887,21 +2489,55 @@
       </w:pPr>
       <w:r>
         <w:rPr>
-          <w:rStyle w:val="VerbatimChar"/>
-        </w:rPr>
-        <w:t xml:space="preserve">scripts/pre_build/check_cm_export_charset_valid.sh</w:t>
-      </w:r>
-      <w:r>
-        <w:t xml:space="preserve"> </w:t>
-      </w:r>
-      <w:r>
-        <w:t xml:space="preserve">— the gate over this</w:t>
-      </w:r>
-      <w:r>
-        <w:t xml:space="preserve"> </w:t>
-      </w:r>
-      <w:r>
-        <w:t xml:space="preserve">script’s output; reads a monotone-decreasing ratchet baseline.</w:t>
+          <w:b/>
+          <w:bCs/>
+        </w:rPr>
+        <w:t xml:space="preserve">A render byte-identical to the existing twin is not rewritten.</w:t>
+      </w:r>
+      <w:r>
+        <w:t xml:space="preserve"> </w:t>
+      </w:r>
+      <w:r>
+        <w:t xml:space="preserve">The twin</w:t>
+      </w:r>
+      <w:r>
+        <w:t xml:space="preserve"> </w:t>
+      </w:r>
+      <w:r>
+        <w:t xml:space="preserve">is only re-stamped (</w:t>
+      </w:r>
+      <w:r>
+        <w:rPr>
+          <w:rStyle w:val="VerbatimChar"/>
+        </w:rPr>
+        <w:t xml:space="preserve">touch</w:t>
+      </w:r>
+      <w:r>
+        <w:t xml:space="preserve">), which records</w:t>
+      </w:r>
+      <w:r>
+        <w:t xml:space="preserve"> </w:t>
+      </w:r>
+      <w:r>
+        <w:t xml:space="preserve">“verified against the current</w:t>
+      </w:r>
+      <w:r>
+        <w:t xml:space="preserve"> </w:t>
+      </w:r>
+      <w:r>
+        <w:t xml:space="preserve">source”</w:t>
+      </w:r>
+      <w:r>
+        <w:t xml:space="preserve"> </w:t>
+      </w:r>
+      <w:r>
+        <w:t xml:space="preserve">for the mtime half of the oracle, so a locally-edited or</w:t>
+      </w:r>
+      <w:r>
+        <w:t xml:space="preserve"> </w:t>
+      </w:r>
+      <w:r>
+        <w:t xml:space="preserve">untracked source is not re-rendered on the next run.</w:t>
       </w:r>
     </w:p>
     <w:p>
@@ -2914,21 +2550,2211 @@
       </w:pPr>
       <w:r>
         <w:rPr>
-          <w:rStyle w:val="VerbatimChar"/>
-        </w:rPr>
-        <w:t xml:space="preserve">scripts/regenerate-continuation-exports.sh</w:t>
-      </w:r>
-      <w:r>
-        <w:t xml:space="preserve"> </w:t>
-      </w:r>
-      <w:r>
-        <w:t xml:space="preserve">— deliberately narrow</w:t>
-      </w:r>
-      <w:r>
-        <w:t xml:space="preserve"> </w:t>
-      </w:r>
-      <w:r>
-        <w:t xml:space="preserve">CONTINUATION-only regen; see its own guide for why it does not call this.</w:t>
+          <w:b/>
+          <w:bCs/>
+        </w:rPr>
+        <w:t xml:space="preserve">Every generated</w:t>
+      </w:r>
+      <w:r>
+        <w:rPr>
+          <w:b/>
+          <w:bCs/>
+        </w:rPr>
+        <w:t xml:space="preserve"> </w:t>
+      </w:r>
+      <w:r>
+        <w:rPr>
+          <w:rStyle w:val="VerbatimChar"/>
+          <w:b/>
+          <w:bCs/>
+        </w:rPr>
+        <w:t xml:space="preserve">.html</w:t>
+      </w:r>
+      <w:r>
+        <w:rPr>
+          <w:b/>
+          <w:bCs/>
+        </w:rPr>
+        <w:t xml:space="preserve"> </w:t>
+      </w:r>
+      <w:r>
+        <w:rPr>
+          <w:b/>
+          <w:bCs/>
+        </w:rPr>
+        <w:t xml:space="preserve">records what it was built from</w:t>
+      </w:r>
+      <w:r>
+        <w:t xml:space="preserve">, in two</w:t>
+      </w:r>
+      <w:r>
+        <w:t xml:space="preserve"> </w:t>
+      </w:r>
+      <w:r>
+        <w:rPr>
+          <w:rStyle w:val="VerbatimChar"/>
+        </w:rPr>
+        <w:t xml:space="preserve">&lt;meta&gt;</w:t>
+      </w:r>
+      <w:r>
+        <w:t xml:space="preserve"> </w:t>
+      </w:r>
+      <w:r>
+        <w:t xml:space="preserve">elements inserted just before the first</w:t>
+      </w:r>
+      <w:r>
+        <w:t xml:space="preserve"> </w:t>
+      </w:r>
+      <w:r>
+        <w:rPr>
+          <w:rStyle w:val="VerbatimChar"/>
+        </w:rPr>
+        <w:t xml:space="preserve">&lt;/head&gt;</w:t>
+      </w:r>
+      <w:r>
+        <w:t xml:space="preserve"> </w:t>
+      </w:r>
+      <w:r>
+        <w:t xml:space="preserve">after pandoc has run</w:t>
+      </w:r>
+      <w:r>
+        <w:t xml:space="preserve"> </w:t>
+      </w:r>
+      <w:r>
+        <w:t xml:space="preserve">(not via</w:t>
+      </w:r>
+      <w:r>
+        <w:t xml:space="preserve"> </w:t>
+      </w:r>
+      <w:r>
+        <w:rPr>
+          <w:rStyle w:val="VerbatimChar"/>
+        </w:rPr>
+        <w:t xml:space="preserve">pandoc -H</w:t>
+      </w:r>
+      <w:r>
+        <w:t xml:space="preserve">, which suppresses a document’s own YAML</w:t>
+      </w:r>
+      <w:r>
+        <w:t xml:space="preserve"> </w:t>
+      </w:r>
+      <w:r>
+        <w:rPr>
+          <w:rStyle w:val="VerbatimChar"/>
+        </w:rPr>
+        <w:t xml:space="preserve">header-includes</w:t>
+      </w:r>
+      <w:r>
+        <w:t xml:space="preserve">; the bytes otherwise equal the former</w:t>
+      </w:r>
+      <w:r>
+        <w:t xml:space="preserve"> </w:t>
+      </w:r>
+      <w:r>
+        <w:rPr>
+          <w:rStyle w:val="VerbatimChar"/>
+        </w:rPr>
+        <w:t xml:space="preserve">-H</w:t>
+      </w:r>
+      <w:r>
+        <w:t xml:space="preserve"> </w:t>
+      </w:r>
+      <w:r>
+        <w:t xml:space="preserve">output):</w:t>
+      </w:r>
+      <w:r>
+        <w:t xml:space="preserve"> </w:t>
+      </w:r>
+      <w:r>
+        <w:rPr>
+          <w:rStyle w:val="VerbatimChar"/>
+        </w:rPr>
+        <w:t xml:space="preserve">x-export-source-sha256</w:t>
+      </w:r>
+      <w:r>
+        <w:t xml:space="preserve"> </w:t>
+      </w:r>
+      <w:r>
+        <w:t xml:space="preserve">(sha256 of the source bytes) and</w:t>
+      </w:r>
+      <w:r>
+        <w:t xml:space="preserve"> </w:t>
+      </w:r>
+      <w:r>
+        <w:rPr>
+          <w:rStyle w:val="VerbatimChar"/>
+        </w:rPr>
+        <w:t xml:space="preserve">dcterms.modified</w:t>
+      </w:r>
+      <w:r>
+        <w:t xml:space="preserve"> </w:t>
+      </w:r>
+      <w:r>
+        <w:t xml:space="preserve">(the per-file</w:t>
+      </w:r>
+      <w:r>
+        <w:t xml:space="preserve"> </w:t>
+      </w:r>
+      <w:r>
+        <w:rPr>
+          <w:rStyle w:val="VerbatimChar"/>
+        </w:rPr>
+        <w:t xml:space="preserve">SOURCE_DATE_EPOCH</w:t>
+      </w:r>
+      <w:r>
+        <w:t xml:space="preserve">, i.e. the source</w:t>
+      </w:r>
+      <w:r>
+        <w:t xml:space="preserve"> </w:t>
+      </w:r>
+      <w:r>
+        <w:t xml:space="preserve">revision time).</w:t>
+      </w:r>
+      <w:r>
+        <w:t xml:space="preserve"> </w:t>
+      </w:r>
+      <w:r>
+        <w:rPr>
+          <w:rStyle w:val="VerbatimChar"/>
+        </w:rPr>
+        <w:t xml:space="preserve">weasyprint</w:t>
+      </w:r>
+      <w:r>
+        <w:t xml:space="preserve"> </w:t>
+      </w:r>
+      <w:r>
+        <w:t xml:space="preserve">maps</w:t>
+      </w:r>
+      <w:r>
+        <w:t xml:space="preserve"> </w:t>
+      </w:r>
+      <w:r>
+        <w:rPr>
+          <w:rStyle w:val="VerbatimChar"/>
+        </w:rPr>
+        <w:t xml:space="preserve">dcterms.modified</w:t>
+      </w:r>
+      <w:r>
+        <w:t xml:space="preserve"> </w:t>
+      </w:r>
+      <w:r>
+        <w:t xml:space="preserve">into the PDF’s</w:t>
+      </w:r>
+      <w:r>
+        <w:t xml:space="preserve"> </w:t>
+      </w:r>
+      <w:r>
+        <w:rPr>
+          <w:rStyle w:val="VerbatimChar"/>
+        </w:rPr>
+        <w:t xml:space="preserve">ModDate</w:t>
+      </w:r>
+      <w:r>
+        <w:t xml:space="preserve">, so the</w:t>
+      </w:r>
+      <w:r>
+        <w:t xml:space="preserve"> </w:t>
+      </w:r>
+      <w:r>
+        <w:rPr>
+          <w:rStyle w:val="VerbatimChar"/>
+        </w:rPr>
+        <w:t xml:space="preserve">.pdf</w:t>
+      </w:r>
+      <w:r>
+        <w:t xml:space="preserve"> </w:t>
+      </w:r>
+      <w:r>
+        <w:t xml:space="preserve">moves with it.</w:t>
+      </w:r>
+    </w:p>
+    <w:p>
+      <w:pPr>
+        <w:pStyle w:val="FirstParagraph"/>
+      </w:pPr>
+      <w:r>
+        <w:t xml:space="preserve">Why rule 2 is needed: the gate judges a committed pair by git history. A</w:t>
+      </w:r>
+      <w:r>
+        <w:t xml:space="preserve"> </w:t>
+      </w:r>
+      <w:r>
+        <w:t xml:space="preserve">whitespace-only</w:t>
+      </w:r>
+      <w:r>
+        <w:t xml:space="preserve"> </w:t>
+      </w:r>
+      <w:r>
+        <w:rPr>
+          <w:rStyle w:val="VerbatimChar"/>
+        </w:rPr>
+        <w:t xml:space="preserve">.md</w:t>
+      </w:r>
+      <w:r>
+        <w:t xml:space="preserve"> </w:t>
+      </w:r>
+      <w:r>
+        <w:t xml:space="preserve">commit made the</w:t>
+      </w:r>
+      <w:r>
+        <w:t xml:space="preserve"> </w:t>
+      </w:r>
+      <w:r>
+        <w:rPr>
+          <w:rStyle w:val="VerbatimChar"/>
+        </w:rPr>
+        <w:t xml:space="preserve">.md</w:t>
+      </w:r>
+      <w:r>
+        <w:t xml:space="preserve"> </w:t>
+      </w:r>
+      <w:r>
+        <w:t xml:space="preserve">newer than its twins, but pandoc</w:t>
+      </w:r>
+      <w:r>
+        <w:t xml:space="preserve"> </w:t>
+      </w:r>
+      <w:r>
+        <w:t xml:space="preserve">and weasyprint rendered byte-</w:t>
+      </w:r>
+      <w:r>
+        <w:rPr>
+          <w:b/>
+          <w:bCs/>
+        </w:rPr>
+        <w:t xml:space="preserve">identical</w:t>
+      </w:r>
+      <w:r>
+        <w:t xml:space="preserve"> </w:t>
+      </w:r>
+      <w:r>
+        <w:rPr>
+          <w:rStyle w:val="VerbatimChar"/>
+        </w:rPr>
+        <w:t xml:space="preserve">.html</w:t>
+      </w:r>
+      <w:r>
+        <w:t xml:space="preserve">/</w:t>
+      </w:r>
+      <w:r>
+        <w:rPr>
+          <w:rStyle w:val="VerbatimChar"/>
+        </w:rPr>
+        <w:t xml:space="preserve">.pdf</w:t>
+      </w:r>
+      <w:r>
+        <w:t xml:space="preserve"> </w:t>
+      </w:r>
+      <w:r>
+        <w:t xml:space="preserve">for it, so nothing</w:t>
+      </w:r>
+      <w:r>
+        <w:t xml:space="preserve"> </w:t>
+      </w:r>
+      <w:r>
+        <w:t xml:space="preserve">could be committed and the gate called the pair stale forever (measured: only</w:t>
+      </w:r>
+      <w:r>
+        <w:t xml:space="preserve"> </w:t>
+      </w:r>
+      <w:r>
+        <w:t xml:space="preserve">the</w:t>
+      </w:r>
+      <w:r>
+        <w:t xml:space="preserve"> </w:t>
+      </w:r>
+      <w:r>
+        <w:rPr>
+          <w:rStyle w:val="VerbatimChar"/>
+        </w:rPr>
+        <w:t xml:space="preserve">.docx</w:t>
+      </w:r>
+      <w:r>
+        <w:t xml:space="preserve">, whose stamp moved, showed up in</w:t>
+      </w:r>
+      <w:r>
+        <w:t xml:space="preserve"> </w:t>
+      </w:r>
+      <w:r>
+        <w:rPr>
+          <w:rStyle w:val="VerbatimChar"/>
+        </w:rPr>
+        <w:t xml:space="preserve">git status</w:t>
+      </w:r>
+      <w:r>
+        <w:t xml:space="preserve">). With the</w:t>
+      </w:r>
+      <w:r>
+        <w:t xml:space="preserve"> </w:t>
+      </w:r>
+      <w:r>
+        <w:t xml:space="preserve">provenance record, a regeneration for a newer source revision always produces</w:t>
+      </w:r>
+      <w:r>
+        <w:t xml:space="preserve"> </w:t>
+      </w:r>
+      <w:r>
+        <w:t xml:space="preserve">committable bytes; after committing them the gate calls the pair fresh. Both</w:t>
+      </w:r>
+      <w:r>
+        <w:t xml:space="preserve"> </w:t>
+      </w:r>
+      <w:r>
+        <w:t xml:space="preserve">values are pure functions of (content, history) — never the wall clock — so</w:t>
+      </w:r>
+      <w:r>
+        <w:t xml:space="preserve"> </w:t>
+      </w:r>
+      <w:r>
+        <w:t xml:space="preserve">output stays byte-stable. The oracle and the gate are unchanged.</w:t>
+      </w:r>
+    </w:p>
+    <w:p>
+      <w:pPr>
+        <w:pStyle w:val="BodyText"/>
+      </w:pPr>
+      <w:r>
+        <w:rPr>
+          <w:b/>
+          <w:bCs/>
+        </w:rPr>
+        <w:t xml:space="preserve">Limit:</w:t>
+      </w:r>
+      <w:r>
+        <w:t xml:space="preserve"> </w:t>
+      </w:r>
+      <w:r>
+        <w:t xml:space="preserve">when the caller pins one</w:t>
+      </w:r>
+      <w:r>
+        <w:t xml:space="preserve"> </w:t>
+      </w:r>
+      <w:r>
+        <w:rPr>
+          <w:rStyle w:val="VerbatimChar"/>
+        </w:rPr>
+        <w:t xml:space="preserve">SOURCE_DATE_EPOCH</w:t>
+      </w:r>
+      <w:r>
+        <w:t xml:space="preserve"> </w:t>
+      </w:r>
+      <w:r>
+        <w:t xml:space="preserve">for every revision and</w:t>
+      </w:r>
+      <w:r>
+        <w:t xml:space="preserve"> </w:t>
+      </w:r>
+      <w:r>
+        <w:t xml:space="preserve">a later commit restores a</w:t>
+      </w:r>
+      <w:r>
+        <w:t xml:space="preserve"> </w:t>
+      </w:r>
+      <w:r>
+        <w:rPr>
+          <w:rStyle w:val="VerbatimChar"/>
+        </w:rPr>
+        <w:t xml:space="preserve">.md</w:t>
+      </w:r>
+      <w:r>
+        <w:t xml:space="preserve"> </w:t>
+      </w:r>
+      <w:r>
+        <w:t xml:space="preserve">to content an older twin was already built</w:t>
+      </w:r>
+      <w:r>
+        <w:t xml:space="preserve"> </w:t>
+      </w:r>
+      <w:r>
+        <w:t xml:space="preserve">from, the render is identical again and the pair cannot converge by writing</w:t>
+      </w:r>
+      <w:r>
+        <w:t xml:space="preserve"> </w:t>
+      </w:r>
+      <w:r>
+        <w:t xml:space="preserve">alone. Closing that residual case needs the staleness oracle itself to</w:t>
+      </w:r>
+      <w:r>
+        <w:t xml:space="preserve"> </w:t>
+      </w:r>
+      <w:r>
+        <w:t xml:space="preserve">compare content fingerprints; that is an oracle/gate change and is</w:t>
+      </w:r>
+      <w:r>
+        <w:t xml:space="preserve"> </w:t>
+      </w:r>
+      <w:r>
+        <w:rPr>
+          <w:b/>
+          <w:bCs/>
+        </w:rPr>
+        <w:t xml:space="preserve">not</w:t>
+      </w:r>
+      <w:r>
+        <w:t xml:space="preserve"> </w:t>
+      </w:r>
+      <w:r>
+        <w:t xml:space="preserve">part of this script.</w:t>
+      </w:r>
+      <w:r>
+        <w:t xml:space="preserve"> </w:t>
+      </w:r>
+      <w:r>
+        <w:t xml:space="preserve">Two</w:t>
+      </w:r>
+      <w:r>
+        <w:t xml:space="preserve"> </w:t>
+      </w:r>
+      <w:r>
+        <w:rPr>
+          <w:rStyle w:val="VerbatimChar"/>
+        </w:rPr>
+        <w:t xml:space="preserve">.md</w:t>
+      </w:r>
+      <w:r>
+        <w:t xml:space="preserve"> </w:t>
+      </w:r>
+      <w:r>
+        <w:t xml:space="preserve">commits within the same second share an epoch (only the</w:t>
+      </w:r>
+      <w:r>
+        <w:t xml:space="preserve"> </w:t>
+      </w:r>
+      <w:r>
+        <w:rPr>
+          <w:rStyle w:val="VerbatimChar"/>
+        </w:rPr>
+        <w:t xml:space="preserve">.html</w:t>
+      </w:r>
+      <w:r>
+        <w:t xml:space="preserve"> </w:t>
+      </w:r>
+      <w:r>
+        <w:t xml:space="preserve">sha then moves; the</w:t>
+      </w:r>
+      <w:r>
+        <w:t xml:space="preserve"> </w:t>
+      </w:r>
+      <w:r>
+        <w:rPr>
+          <w:rStyle w:val="VerbatimChar"/>
+        </w:rPr>
+        <w:t xml:space="preserve">.pdf</w:t>
+      </w:r>
+      <w:r>
+        <w:t xml:space="preserve"> </w:t>
+      </w:r>
+      <w:r>
+        <w:t xml:space="preserve">may not).</w:t>
+      </w:r>
+    </w:p>
+    <w:bookmarkEnd w:id="19"/>
+    <w:bookmarkStart w:id="20" w:name="Xcbbeb90524301892411713efd6c84f2ba632dbf"/>
+    <w:p>
+      <w:pPr>
+        <w:pStyle w:val="Heading3"/>
+      </w:pPr>
+      <w:r>
+        <w:t xml:space="preserve">Docs Chain-owned twins are rendered exactly as the engine renders them (BOB-249 review I1)</w:t>
+      </w:r>
+    </w:p>
+    <w:p>
+      <w:pPr>
+        <w:pStyle w:val="FirstParagraph"/>
+      </w:pPr>
+      <w:r>
+        <w:t xml:space="preserve">A twin that is a node</w:t>
+      </w:r>
+      <w:r>
+        <w:t xml:space="preserve"> </w:t>
+      </w:r>
+      <w:r>
+        <w:rPr>
+          <w:rStyle w:val="VerbatimChar"/>
+        </w:rPr>
+        <w:t xml:space="preserve">path:</w:t>
+      </w:r>
+      <w:r>
+        <w:t xml:space="preserve"> </w:t>
+      </w:r>
+      <w:r>
+        <w:t xml:space="preserve">of any</w:t>
+      </w:r>
+      <w:r>
+        <w:t xml:space="preserve"> </w:t>
+      </w:r>
+      <w:r>
+        <w:rPr>
+          <w:rStyle w:val="VerbatimChar"/>
+        </w:rPr>
+        <w:t xml:space="preserve">.docs_chain/contexts/*.yaml</w:t>
+      </w:r>
+      <w:r>
+        <w:t xml:space="preserve"> </w:t>
+      </w:r>
+      <w:r>
+        <w:t xml:space="preserve">context</w:t>
+      </w:r>
+      <w:r>
+        <w:t xml:space="preserve"> </w:t>
+      </w:r>
+      <w:r>
+        <w:t xml:space="preserve">(for example</w:t>
+      </w:r>
+      <w:r>
+        <w:t xml:space="preserve"> </w:t>
+      </w:r>
+      <w:r>
+        <w:rPr>
+          <w:rStyle w:val="VerbatimChar"/>
+        </w:rPr>
+        <w:t xml:space="preserve">docs/features/Status.html</w:t>
+      </w:r>
+      <w:r>
+        <w:t xml:space="preserve">) is owned by the Docs Chain engine,</w:t>
+      </w:r>
+      <w:r>
+        <w:t xml:space="preserve"> </w:t>
+      </w:r>
+      <w:r>
+        <w:t xml:space="preserve">whose</w:t>
+      </w:r>
+      <w:r>
+        <w:t xml:space="preserve"> </w:t>
+      </w:r>
+      <w:r>
+        <w:rPr>
+          <w:rStyle w:val="VerbatimChar"/>
+        </w:rPr>
+        <w:t xml:space="preserve">verify</w:t>
+      </w:r>
+      <w:r>
+        <w:t xml:space="preserve"> </w:t>
+      </w:r>
+      <w:r>
+        <w:t xml:space="preserve">(pre-build invariant 24,</w:t>
+      </w:r>
+      <w:r>
+        <w:t xml:space="preserve"> </w:t>
+      </w:r>
+      <w:r>
+        <w:rPr>
+          <w:rStyle w:val="VerbatimChar"/>
+        </w:rPr>
+        <w:t xml:space="preserve">CM-DOCS-CHAIN-ENGINE-VERIFY</w:t>
+      </w:r>
+      <w:r>
+        <w:t xml:space="preserve">)</w:t>
+      </w:r>
+      <w:r>
+        <w:t xml:space="preserve"> </w:t>
+      </w:r>
+      <w:r>
+        <w:t xml:space="preserve">recomputes it and compares</w:t>
+      </w:r>
+      <w:r>
+        <w:t xml:space="preserve"> </w:t>
+      </w:r>
+      <w:r>
+        <w:rPr>
+          <w:b/>
+          <w:bCs/>
+        </w:rPr>
+        <w:t xml:space="preserve">bytes</w:t>
+      </w:r>
+      <w:r>
+        <w:t xml:space="preserve">. For such a twin the script uses the</w:t>
+      </w:r>
+      <w:r>
+        <w:t xml:space="preserve"> </w:t>
+      </w:r>
+      <w:r>
+        <w:t xml:space="preserve">engine’s own argv from</w:t>
+      </w:r>
+      <w:r>
+        <w:t xml:space="preserve"> </w:t>
+      </w:r>
+      <w:r>
+        <w:rPr>
+          <w:rStyle w:val="VerbatimChar"/>
+        </w:rPr>
+        <w:t xml:space="preserve">constitution/submodules/docs_chain/internal/adapter/derived.go</w:t>
+      </w:r>
+      <w:r>
+        <w:t xml:space="preserve"> </w:t>
+      </w:r>
+      <w:r>
+        <w:t xml:space="preserve">—</w:t>
+      </w:r>
+      <w:r>
+        <w:t xml:space="preserve"> </w:t>
+      </w:r>
+      <w:r>
+        <w:rPr>
+          <w:rStyle w:val="VerbatimChar"/>
+        </w:rPr>
+        <w:t xml:space="preserve">pandoc --standalone --from=markdown --to=html --metadata title=&lt;base&gt;</w:t>
+      </w:r>
+      <w:r>
+        <w:t xml:space="preserve">,</w:t>
+      </w:r>
+      <w:r>
+        <w:t xml:space="preserve"> </w:t>
+      </w:r>
+      <w:r>
+        <w:rPr>
+          <w:rStyle w:val="VerbatimChar"/>
+        </w:rPr>
+        <w:t xml:space="preserve">pandoc --from=markdown --to=docx --metadata title=&lt;base&gt;</w:t>
+      </w:r>
+      <w:r>
+        <w:t xml:space="preserve">,</w:t>
+      </w:r>
+      <w:r>
+        <w:t xml:space="preserve"> </w:t>
+      </w:r>
+      <w:r>
+        <w:rPr>
+          <w:rStyle w:val="VerbatimChar"/>
+        </w:rPr>
+        <w:t xml:space="preserve">weasyprint --base-url &lt;live pdf path&gt;</w:t>
+      </w:r>
+      <w:r>
+        <w:t xml:space="preserve"> </w:t>
+      </w:r>
+      <w:r>
+        <w:t xml:space="preserve">— with</w:t>
+      </w:r>
+      <w:r>
+        <w:t xml:space="preserve"> </w:t>
+      </w:r>
+      <w:r>
+        <w:rPr>
+          <w:rStyle w:val="VerbatimChar"/>
+        </w:rPr>
+        <w:t xml:space="preserve">SOURCE_DATE_EPOCH=946684800</w:t>
+      </w:r>
+      <w:r>
+        <w:t xml:space="preserve"> </w:t>
+      </w:r>
+      <w:r>
+        <w:t xml:space="preserve">and</w:t>
+      </w:r>
+      <w:r>
+        <w:t xml:space="preserve"> </w:t>
+      </w:r>
+      <w:r>
+        <w:rPr>
+          <w:b/>
+          <w:bCs/>
+        </w:rPr>
+        <w:t xml:space="preserve">no</w:t>
+      </w:r>
+      <w:r>
+        <w:t xml:space="preserve"> </w:t>
+      </w:r>
+      <w:r>
+        <w:t xml:space="preserve">provenance tags, so running this script before</w:t>
+      </w:r>
+      <w:r>
+        <w:t xml:space="preserve"> </w:t>
+      </w:r>
+      <w:r>
+        <w:rPr>
+          <w:rStyle w:val="VerbatimChar"/>
+        </w:rPr>
+        <w:t xml:space="preserve">docs_chain sync</w:t>
+      </w:r>
+      <w:r>
+        <w:t xml:space="preserve"> </w:t>
+      </w:r>
+      <w:r>
+        <w:t xml:space="preserve">cannot make invariant 24 fail. Every other twin keeps the provenance tags. A</w:t>
+      </w:r>
+      <w:r>
+        <w:t xml:space="preserve"> </w:t>
+      </w:r>
+      <w:r>
+        <w:t xml:space="preserve">context file with no parsable node path prints one</w:t>
+      </w:r>
+      <w:r>
+        <w:t xml:space="preserve"> </w:t>
+      </w:r>
+      <w:r>
+        <w:rPr>
+          <w:rStyle w:val="VerbatimChar"/>
+        </w:rPr>
+        <w:t xml:space="preserve">NOTE:</w:t>
+      </w:r>
+      <w:r>
+        <w:t xml:space="preserve"> </w:t>
+      </w:r>
+      <w:r>
+        <w:t xml:space="preserve">line and its files</w:t>
+      </w:r>
+      <w:r>
+        <w:t xml:space="preserve"> </w:t>
+      </w:r>
+      <w:r>
+        <w:t xml:space="preserve">are treated as not owned.</w:t>
+      </w:r>
+      <w:r>
+        <w:t xml:space="preserve"> </w:t>
+      </w:r>
+      <w:r>
+        <w:rPr>
+          <w:b/>
+          <w:bCs/>
+        </w:rPr>
+        <w:t xml:space="preserve">Limit:</w:t>
+      </w:r>
+      <w:r>
+        <w:t xml:space="preserve"> </w:t>
+      </w:r>
+      <w:r>
+        <w:t xml:space="preserve">an engine-owned</w:t>
+      </w:r>
+      <w:r>
+        <w:t xml:space="preserve"> </w:t>
+      </w:r>
+      <w:r>
+        <w:rPr>
+          <w:rStyle w:val="VerbatimChar"/>
+        </w:rPr>
+        <w:t xml:space="preserve">.html</w:t>
+      </w:r>
+      <w:r>
+        <w:t xml:space="preserve"> </w:t>
+      </w:r>
+      <w:r>
+        <w:t xml:space="preserve">has no</w:t>
+      </w:r>
+      <w:r>
+        <w:t xml:space="preserve"> </w:t>
+      </w:r>
+      <w:r>
+        <w:t xml:space="preserve">provenance record, so the rule-2 convergence above does not apply to it.</w:t>
+      </w:r>
+      <w:r>
+        <w:t xml:space="preserve"> </w:t>
+      </w:r>
+      <w:r>
+        <w:t xml:space="preserve">Guard:</w:t>
+      </w:r>
+      <w:r>
+        <w:t xml:space="preserve"> </w:t>
+      </w:r>
+      <w:r>
+        <w:rPr>
+          <w:rStyle w:val="VerbatimChar"/>
+        </w:rPr>
+        <w:t xml:space="preserve">tests/unit/test_generate_markdown_exports_engine_parity.sh</w:t>
+      </w:r>
+      <w:r>
+        <w:t xml:space="preserve">.</w:t>
+      </w:r>
+    </w:p>
+    <w:bookmarkEnd w:id="20"/>
+    <w:bookmarkStart w:id="21" w:name="Xfaed4422bb711d4a7c96f5014cc647d47099b35"/>
+    <w:p>
+      <w:pPr>
+        <w:pStyle w:val="Heading3"/>
+      </w:pPr>
+      <w:r>
+        <w:t xml:space="preserve">Structural validity check (BOB-249 review M3)</w:t>
+      </w:r>
+    </w:p>
+    <w:p>
+      <w:pPr>
+        <w:pStyle w:val="FirstParagraph"/>
+      </w:pPr>
+      <w:r>
+        <w:t xml:space="preserve">History says nothing about</w:t>
+      </w:r>
+      <w:r>
+        <w:t xml:space="preserve"> </w:t>
+      </w:r>
+      <w:r>
+        <w:rPr>
+          <w:b/>
+          <w:bCs/>
+        </w:rPr>
+        <w:t xml:space="preserve">content</w:t>
+      </w:r>
+      <w:r>
+        <w:t xml:space="preserve">: a twin corrupted after it was</w:t>
+      </w:r>
+      <w:r>
+        <w:t xml:space="preserve"> </w:t>
+      </w:r>
+      <w:r>
+        <w:t xml:space="preserve">generated (garbage bytes with a newer mtime, or a corruption that was</w:t>
+      </w:r>
+      <w:r>
+        <w:t xml:space="preserve"> </w:t>
+      </w:r>
+      <w:r>
+        <w:t xml:space="preserve">committed) used to be judged</w:t>
+      </w:r>
+      <w:r>
+        <w:t xml:space="preserve"> </w:t>
+      </w:r>
+      <w:r>
+        <w:t xml:space="preserve">“fresh”</w:t>
+      </w:r>
+      <w:r>
+        <w:t xml:space="preserve"> </w:t>
+      </w:r>
+      <w:r>
+        <w:t xml:space="preserve">by writer and gate alike, forever. Each</w:t>
+      </w:r>
+      <w:r>
+        <w:t xml:space="preserve"> </w:t>
+      </w:r>
+      <w:r>
+        <w:t xml:space="preserve">existing twin is now also checked for cheap</w:t>
+      </w:r>
+      <w:r>
+        <w:t xml:space="preserve"> </w:t>
+      </w:r>
+      <w:r>
+        <w:rPr>
+          <w:b/>
+          <w:bCs/>
+        </w:rPr>
+        <w:t xml:space="preserve">structural</w:t>
+      </w:r>
+      <w:r>
+        <w:t xml:space="preserve"> </w:t>
+      </w:r>
+      <w:r>
+        <w:t xml:space="preserve">validity, and an</w:t>
+      </w:r>
+      <w:r>
+        <w:t xml:space="preserve"> </w:t>
+      </w:r>
+      <w:r>
+        <w:t xml:space="preserve">invalid one is regenerated:</w:t>
+      </w:r>
+    </w:p>
+    <w:tbl>
+      <w:tblPr>
+        <w:tblStyle w:val="Table"/>
+        <w:tblW w:type="pct" w:w="5000"/>
+        <w:tblLayout w:type="fixed"/>
+        <w:tblLook w:firstRow="1" w:lastRow="0" w:firstColumn="0" w:lastColumn="0" w:noHBand="0" w:noVBand="0" w:val="0020"/>
+      </w:tblPr>
+      <w:tblGrid>
+        <w:gridCol w:w="3394"/>
+        <w:gridCol w:w="4525"/>
+      </w:tblGrid>
+      <w:tr>
+        <w:trPr>
+          <w:tblHeader w:val="on"/>
+        </w:trPr>
+        <w:tc>
+          <w:tcPr/>
+          <w:p>
+            <w:pPr>
+              <w:pStyle w:val="Compact"/>
+            </w:pPr>
+            <w:r>
+              <w:t xml:space="preserve">Twin</w:t>
+            </w:r>
+          </w:p>
+        </w:tc>
+        <w:tc>
+          <w:tcPr/>
+          <w:p>
+            <w:pPr>
+              <w:pStyle w:val="Compact"/>
+            </w:pPr>
+            <w:r>
+              <w:t xml:space="preserve">Valid when</w:t>
+            </w:r>
+          </w:p>
+        </w:tc>
+      </w:tr>
+      <w:tr>
+        <w:tc>
+          <w:tcPr/>
+          <w:p>
+            <w:pPr>
+              <w:pStyle w:val="Compact"/>
+            </w:pPr>
+            <w:r>
+              <w:rPr>
+                <w:rStyle w:val="VerbatimChar"/>
+              </w:rPr>
+              <w:t xml:space="preserve">.html</w:t>
+            </w:r>
+          </w:p>
+        </w:tc>
+        <w:tc>
+          <w:tcPr/>
+          <w:p>
+            <w:pPr>
+              <w:pStyle w:val="Compact"/>
+            </w:pPr>
+            <w:r>
+              <w:t xml:space="preserve">it has a</w:t>
+            </w:r>
+            <w:r>
+              <w:t xml:space="preserve"> </w:t>
+            </w:r>
+            <w:r>
+              <w:rPr>
+                <w:rStyle w:val="VerbatimChar"/>
+              </w:rPr>
+              <w:t xml:space="preserve">&lt;meta … charset&gt;</w:t>
+            </w:r>
+            <w:r>
+              <w:t xml:space="preserve"> </w:t>
+            </w:r>
+            <w:r>
+              <w:t xml:space="preserve">element</w:t>
+            </w:r>
+            <w:r>
+              <w:t xml:space="preserve"> </w:t>
+            </w:r>
+            <w:r>
+              <w:rPr>
+                <w:b/>
+                <w:bCs/>
+              </w:rPr>
+              <w:t xml:space="preserve">and</w:t>
+            </w:r>
+            <w:r>
+              <w:t xml:space="preserve"> </w:t>
+            </w:r>
+            <w:r>
+              <w:t xml:space="preserve">a closing</w:t>
+            </w:r>
+            <w:r>
+              <w:t xml:space="preserve"> </w:t>
+            </w:r>
+            <w:r>
+              <w:rPr>
+                <w:rStyle w:val="VerbatimChar"/>
+              </w:rPr>
+              <w:t xml:space="preserve">&lt;/html&gt;</w:t>
+            </w:r>
+          </w:p>
+        </w:tc>
+      </w:tr>
+      <w:tr>
+        <w:tc>
+          <w:tcPr/>
+          <w:p>
+            <w:pPr>
+              <w:pStyle w:val="Compact"/>
+            </w:pPr>
+            <w:r>
+              <w:rPr>
+                <w:rStyle w:val="VerbatimChar"/>
+              </w:rPr>
+              <w:t xml:space="preserve">.pdf</w:t>
+            </w:r>
+          </w:p>
+        </w:tc>
+        <w:tc>
+          <w:tcPr/>
+          <w:p>
+            <w:pPr>
+              <w:pStyle w:val="Compact"/>
+            </w:pPr>
+            <w:r>
+              <w:t xml:space="preserve">it starts with</w:t>
+            </w:r>
+            <w:r>
+              <w:t xml:space="preserve"> </w:t>
+            </w:r>
+            <w:r>
+              <w:rPr>
+                <w:rStyle w:val="VerbatimChar"/>
+              </w:rPr>
+              <w:t xml:space="preserve">%PDF-</w:t>
+            </w:r>
+            <w:r>
+              <w:t xml:space="preserve"> </w:t>
+            </w:r>
+            <w:r>
+              <w:rPr>
+                <w:b/>
+                <w:bCs/>
+              </w:rPr>
+              <w:t xml:space="preserve">and</w:t>
+            </w:r>
+            <w:r>
+              <w:t xml:space="preserve"> </w:t>
+            </w:r>
+            <w:r>
+              <w:t xml:space="preserve">its last 1 KiB contains</w:t>
+            </w:r>
+            <w:r>
+              <w:t xml:space="preserve"> </w:t>
+            </w:r>
+            <w:r>
+              <w:rPr>
+                <w:rStyle w:val="VerbatimChar"/>
+              </w:rPr>
+              <w:t xml:space="preserve">%%EOF</w:t>
+            </w:r>
+          </w:p>
+        </w:tc>
+      </w:tr>
+      <w:tr>
+        <w:tc>
+          <w:tcPr/>
+          <w:p>
+            <w:pPr>
+              <w:pStyle w:val="Compact"/>
+            </w:pPr>
+            <w:r>
+              <w:rPr>
+                <w:rStyle w:val="VerbatimChar"/>
+              </w:rPr>
+              <w:t xml:space="preserve">.docx</w:t>
+            </w:r>
+          </w:p>
+        </w:tc>
+        <w:tc>
+          <w:tcPr/>
+          <w:p>
+            <w:pPr>
+              <w:pStyle w:val="Compact"/>
+            </w:pPr>
+            <w:r>
+              <w:t xml:space="preserve">it starts with the zip local-header magic</w:t>
+            </w:r>
+            <w:r>
+              <w:t xml:space="preserve"> </w:t>
+            </w:r>
+            <w:r>
+              <w:rPr>
+                <w:rStyle w:val="VerbatimChar"/>
+              </w:rPr>
+              <w:t xml:space="preserve">PK\x03\x04</w:t>
+            </w:r>
+            <w:r>
+              <w:t xml:space="preserve"> </w:t>
+            </w:r>
+            <w:r>
+              <w:rPr>
+                <w:b/>
+                <w:bCs/>
+              </w:rPr>
+              <w:t xml:space="preserve">and</w:t>
+            </w:r>
+            <w:r>
+              <w:t xml:space="preserve"> </w:t>
+            </w:r>
+            <w:r>
+              <w:t xml:space="preserve">(when</w:t>
+            </w:r>
+            <w:r>
+              <w:t xml:space="preserve"> </w:t>
+            </w:r>
+            <w:r>
+              <w:rPr>
+                <w:rStyle w:val="VerbatimChar"/>
+              </w:rPr>
+              <w:t xml:space="preserve">unzip</w:t>
+            </w:r>
+            <w:r>
+              <w:t xml:space="preserve"> </w:t>
+            </w:r>
+            <w:r>
+              <w:t xml:space="preserve">is on</w:t>
+            </w:r>
+            <w:r>
+              <w:t xml:space="preserve"> </w:t>
+            </w:r>
+            <w:r>
+              <w:rPr>
+                <w:rStyle w:val="VerbatimChar"/>
+              </w:rPr>
+              <w:t xml:space="preserve">PATH</w:t>
+            </w:r>
+            <w:r>
+              <w:t xml:space="preserve">) lists</w:t>
+            </w:r>
+            <w:r>
+              <w:t xml:space="preserve"> </w:t>
+            </w:r>
+            <w:r>
+              <w:rPr>
+                <w:rStyle w:val="VerbatimChar"/>
+              </w:rPr>
+              <w:t xml:space="preserve">word/document.xml</w:t>
+            </w:r>
+          </w:p>
+        </w:tc>
+      </w:tr>
+    </w:tbl>
+    <w:p>
+      <w:pPr>
+        <w:pStyle w:val="BodyText"/>
+      </w:pPr>
+      <w:r>
+        <w:t xml:space="preserve">This is deliberately</w:t>
+      </w:r>
+      <w:r>
+        <w:t xml:space="preserve"> </w:t>
+      </w:r>
+      <w:r>
+        <w:rPr>
+          <w:b/>
+          <w:bCs/>
+        </w:rPr>
+        <w:t xml:space="preserve">not</w:t>
+      </w:r>
+      <w:r>
+        <w:t xml:space="preserve"> </w:t>
+      </w:r>
+      <w:r>
+        <w:t xml:space="preserve">a byte comparison with a fresh render — that</w:t>
+      </w:r>
+      <w:r>
+        <w:t xml:space="preserve"> </w:t>
+      </w:r>
+      <w:r>
+        <w:t xml:space="preserve">would re-render the whole corpus on every run. A fresh checkout still</w:t>
+      </w:r>
+      <w:r>
+        <w:t xml:space="preserve"> </w:t>
+      </w:r>
+      <w:r>
+        <w:t xml:space="preserve">rewrites</w:t>
+      </w:r>
+      <w:r>
+        <w:t xml:space="preserve"> </w:t>
+      </w:r>
+      <w:r>
+        <w:rPr>
+          <w:b/>
+          <w:bCs/>
+        </w:rPr>
+        <w:t xml:space="preserve">0</w:t>
+      </w:r>
+      <w:r>
+        <w:t xml:space="preserve"> </w:t>
+      </w:r>
+      <w:r>
+        <w:t xml:space="preserve">twins (measured over all 464 in-scope sources). The checks</w:t>
+      </w:r>
+      <w:r>
+        <w:t xml:space="preserve"> </w:t>
+      </w:r>
+      <w:r>
+        <w:t xml:space="preserve">never pipe a producer into</w:t>
+      </w:r>
+      <w:r>
+        <w:t xml:space="preserve"> </w:t>
+      </w:r>
+      <w:r>
+        <w:rPr>
+          <w:rStyle w:val="VerbatimChar"/>
+        </w:rPr>
+        <w:t xml:space="preserve">grep -q</w:t>
+      </w:r>
+      <w:r>
+        <w:t xml:space="preserve">: an early</w:t>
+      </w:r>
+      <w:r>
+        <w:t xml:space="preserve"> </w:t>
+      </w:r>
+      <w:r>
+        <w:rPr>
+          <w:rStyle w:val="VerbatimChar"/>
+        </w:rPr>
+        <w:t xml:space="preserve">grep</w:t>
+      </w:r>
+      <w:r>
+        <w:t xml:space="preserve"> </w:t>
+      </w:r>
+      <w:r>
+        <w:t xml:space="preserve">exit kills the producer</w:t>
+      </w:r>
+      <w:r>
+        <w:t xml:space="preserve"> </w:t>
+      </w:r>
+      <w:r>
+        <w:t xml:space="preserve">with SIGPIPE, and under</w:t>
+      </w:r>
+      <w:r>
+        <w:t xml:space="preserve"> </w:t>
+      </w:r>
+      <w:r>
+        <w:rPr>
+          <w:rStyle w:val="VerbatimChar"/>
+        </w:rPr>
+        <w:t xml:space="preserve">pipefail</w:t>
+      </w:r>
+      <w:r>
+        <w:t xml:space="preserve"> </w:t>
+      </w:r>
+      <w:r>
+        <w:t xml:space="preserve">a valid twin would read as invalid and be</w:t>
+      </w:r>
+      <w:r>
+        <w:t xml:space="preserve"> </w:t>
+      </w:r>
+      <w:r>
+        <w:t xml:space="preserve">regenerated on every run (§11.4.201(12)).</w:t>
+      </w:r>
+    </w:p>
+    <w:bookmarkEnd w:id="21"/>
+    <w:bookmarkStart w:id="22" w:name="the-charset-self-heal-rule"/>
+    <w:p>
+      <w:pPr>
+        <w:pStyle w:val="Heading3"/>
+      </w:pPr>
+      <w:r>
+        <w:t xml:space="preserve">The charset self-heal rule</w:t>
+      </w:r>
+    </w:p>
+    <w:p>
+      <w:pPr>
+        <w:pStyle w:val="FirstParagraph"/>
+      </w:pPr>
+      <w:r>
+        <w:t xml:space="preserve">Staleness is</w:t>
+      </w:r>
+      <w:r>
+        <w:t xml:space="preserve"> </w:t>
+      </w:r>
+      <w:r>
+        <w:rPr>
+          <w:b/>
+          <w:bCs/>
+        </w:rPr>
+        <w:t xml:space="preserve">not</w:t>
+      </w:r>
+      <w:r>
+        <w:t xml:space="preserve"> </w:t>
+      </w:r>
+      <w:r>
+        <w:t xml:space="preserve">history alone. An</w:t>
+      </w:r>
+      <w:r>
+        <w:t xml:space="preserve"> </w:t>
+      </w:r>
+      <w:r>
+        <w:rPr>
+          <w:rStyle w:val="VerbatimChar"/>
+        </w:rPr>
+        <w:t xml:space="preserve">.html</w:t>
+      </w:r>
+      <w:r>
+        <w:t xml:space="preserve"> </w:t>
+      </w:r>
+      <w:r>
+        <w:t xml:space="preserve">that exists and is mtime-fresh</w:t>
+      </w:r>
+      <w:r>
+        <w:t xml:space="preserve"> </w:t>
+      </w:r>
+      <w:r>
+        <w:t xml:space="preserve">but declares</w:t>
+      </w:r>
+      <w:r>
+        <w:t xml:space="preserve"> </w:t>
+      </w:r>
+      <w:r>
+        <w:rPr>
+          <w:b/>
+          <w:bCs/>
+        </w:rPr>
+        <w:t xml:space="preserve">no charset</w:t>
+      </w:r>
+      <w:r>
+        <w:t xml:space="preserve"> </w:t>
+      </w:r>
+      <w:r>
+        <w:t xml:space="preserve">is treated as STALE and regenerated, because such</w:t>
+      </w:r>
+      <w:r>
+        <w:t xml:space="preserve"> </w:t>
+      </w:r>
+      <w:r>
+        <w:t xml:space="preserve">a file is a pre-BOB-169 charset-less fragment that would otherwise persist</w:t>
+      </w:r>
+      <w:r>
+        <w:t xml:space="preserve"> </w:t>
+      </w:r>
+      <w:r>
+        <w:t xml:space="preserve">forever and keep re-baking mojibake into any PDF rendered from it. PDF</w:t>
+      </w:r>
+      <w:r>
+        <w:t xml:space="preserve"> </w:t>
+      </w:r>
+      <w:r>
+        <w:t xml:space="preserve">staleness additionally keys on the</w:t>
+      </w:r>
+      <w:r>
+        <w:t xml:space="preserve"> </w:t>
+      </w:r>
+      <w:r>
+        <w:rPr>
+          <w:rStyle w:val="VerbatimChar"/>
+        </w:rPr>
+        <w:t xml:space="preserve">.html</w:t>
+      </w:r>
+      <w:r>
+        <w:t xml:space="preserve"> </w:t>
+      </w:r>
+      <w:r>
+        <w:t xml:space="preserve">(the PDF is derived from it), so</w:t>
+      </w:r>
+      <w:r>
+        <w:t xml:space="preserve"> </w:t>
+      </w:r>
+      <w:r>
+        <w:t xml:space="preserve">healing the HTML half cannot leave a corrupt PDF behind. An HTML regenerated</w:t>
+      </w:r>
+      <w:r>
+        <w:t xml:space="preserve"> </w:t>
+      </w:r>
+      <w:r>
+        <w:t xml:space="preserve">in the</w:t>
+      </w:r>
+      <w:r>
+        <w:t xml:space="preserve"> </w:t>
+      </w:r>
+      <w:r>
+        <w:rPr>
+          <w:b/>
+          <w:bCs/>
+        </w:rPr>
+        <w:t xml:space="preserve">current</w:t>
+      </w:r>
+      <w:r>
+        <w:t xml:space="preserve"> </w:t>
+      </w:r>
+      <w:r>
+        <w:t xml:space="preserve">run always re-derives its PDF explicitly: the oracle caches</w:t>
+      </w:r>
+      <w:r>
+        <w:t xml:space="preserve"> </w:t>
+      </w:r>
+      <w:r>
+        <w:t xml:space="preserve">the working-tree state once per run, so to it a just-rewritten HTML still</w:t>
+      </w:r>
+      <w:r>
+        <w:t xml:space="preserve"> </w:t>
+      </w:r>
+      <w:r>
+        <w:t xml:space="preserve">looks clean.</w:t>
+      </w:r>
+    </w:p>
+    <w:bookmarkEnd w:id="22"/>
+    <w:bookmarkEnd w:id="23"/>
+    <w:bookmarkStart w:id="27" w:name="internal-behaviour-worth-knowing"/>
+    <w:p>
+      <w:pPr>
+        <w:pStyle w:val="Heading2"/>
+      </w:pPr>
+      <w:r>
+        <w:t xml:space="preserve">Internal behaviour worth knowing</w:t>
+      </w:r>
+    </w:p>
+    <w:bookmarkStart w:id="24" w:name="X03819369ec2a8a1fe3823a5b41788a4e699a903"/>
+    <w:p>
+      <w:pPr>
+        <w:pStyle w:val="Heading3"/>
+      </w:pPr>
+      <w:r>
+        <w:t xml:space="preserve">Capability probes test the artifact, not a prerequisite</w:t>
+      </w:r>
+    </w:p>
+    <w:p>
+      <w:pPr>
+        <w:pStyle w:val="FirstParagraph"/>
+      </w:pPr>
+      <w:r>
+        <w:t xml:space="preserve">The weasyprint probe runs</w:t>
+      </w:r>
+      <w:r>
+        <w:t xml:space="preserve"> </w:t>
+      </w:r>
+      <w:r>
+        <w:rPr>
+          <w:rStyle w:val="VerbatimChar"/>
+        </w:rPr>
+        <w:t xml:space="preserve">weasyprint --version</w:t>
+      </w:r>
+      <w:r>
+        <w:t xml:space="preserve"> </w:t>
+      </w:r>
+      <w:r>
+        <w:t xml:space="preserve">— the real entry point the</w:t>
+      </w:r>
+      <w:r>
+        <w:t xml:space="preserve"> </w:t>
+      </w:r>
+      <w:r>
+        <w:t xml:space="preserve">render path uses. It previously also required</w:t>
+      </w:r>
+      <w:r>
+        <w:t xml:space="preserve"> </w:t>
+      </w:r>
+      <w:r>
+        <w:rPr>
+          <w:rStyle w:val="VerbatimChar"/>
+        </w:rPr>
+        <w:t xml:space="preserve">python3 -c "from weasyprint import HTML"</w:t>
+      </w:r>
+      <w:r>
+        <w:t xml:space="preserve"> </w:t>
+      </w:r>
+      <w:r>
+        <w:t xml:space="preserve">to succeed, which is a</w:t>
+      </w:r>
+      <w:r>
+        <w:t xml:space="preserve"> </w:t>
+      </w:r>
+      <w:r>
+        <w:rPr>
+          <w:b/>
+          <w:bCs/>
+        </w:rPr>
+        <w:t xml:space="preserve">prerequisite</w:t>
+      </w:r>
+      <w:r>
+        <w:t xml:space="preserve"> </w:t>
+      </w:r>
+      <w:r>
+        <w:t xml:space="preserve">probe, not an artifact probe: a</w:t>
+      </w:r>
+      <w:r>
+        <w:t xml:space="preserve"> </w:t>
+      </w:r>
+      <w:r>
+        <w:rPr>
+          <w:rStyle w:val="VerbatimChar"/>
+        </w:rPr>
+        <w:t xml:space="preserve">weasyprint</w:t>
+      </w:r>
+      <w:r>
+        <w:t xml:space="preserve"> </w:t>
+      </w:r>
+      <w:r>
+        <w:t xml:space="preserve">CLI installed</w:t>
+      </w:r>
+      <w:r>
+        <w:t xml:space="preserve"> </w:t>
+      </w:r>
+      <w:r>
+        <w:t xml:space="preserve">into its own isolated environment (</w:t>
+      </w:r>
+      <w:r>
+        <w:rPr>
+          <w:rStyle w:val="VerbatimChar"/>
+        </w:rPr>
+        <w:t xml:space="preserve">uv tool install</w:t>
+      </w:r>
+      <w:r>
+        <w:t xml:space="preserve">,</w:t>
+      </w:r>
+      <w:r>
+        <w:t xml:space="preserve"> </w:t>
+      </w:r>
+      <w:r>
+        <w:rPr>
+          <w:rStyle w:val="VerbatimChar"/>
+        </w:rPr>
+        <w:t xml:space="preserve">pipx</w:t>
+      </w:r>
+      <w:r>
+        <w:t xml:space="preserve">, a venv on</w:t>
+      </w:r>
+      <w:r>
+        <w:t xml:space="preserve"> </w:t>
+      </w:r>
+      <w:r>
+        <w:rPr>
+          <w:rStyle w:val="VerbatimChar"/>
+        </w:rPr>
+        <w:t xml:space="preserve">PATH</w:t>
+      </w:r>
+      <w:r>
+        <w:t xml:space="preserve">) renders PDFs perfectly while being invisible to a system-interpreter</w:t>
+      </w:r>
+      <w:r>
+        <w:t xml:space="preserve"> </w:t>
+      </w:r>
+      <w:r>
+        <w:t xml:space="preserve">import. On this host that made the script announce</w:t>
+      </w:r>
+      <w:r>
+        <w:t xml:space="preserve"> </w:t>
+      </w:r>
+      <w:r>
+        <w:rPr>
+          <w:i/>
+          <w:iCs/>
+        </w:rPr>
+        <w:t xml:space="preserve">“PDF support: not</w:t>
+      </w:r>
+      <w:r>
+        <w:rPr>
+          <w:i/>
+          <w:iCs/>
+        </w:rPr>
+        <w:t xml:space="preserve"> </w:t>
+      </w:r>
+      <w:r>
+        <w:rPr>
+          <w:i/>
+          <w:iCs/>
+        </w:rPr>
+        <w:t xml:space="preserve">available”</w:t>
+      </w:r>
+      <w:r>
+        <w:t xml:space="preserve"> </w:t>
+      </w:r>
+      <w:r>
+        <w:t xml:space="preserve">and produce</w:t>
+      </w:r>
+      <w:r>
+        <w:t xml:space="preserve"> </w:t>
+      </w:r>
+      <w:r>
+        <w:rPr>
+          <w:b/>
+          <w:bCs/>
+        </w:rPr>
+        <w:t xml:space="preserve">zero PDFs while exiting 0</w:t>
+      </w:r>
+      <w:r>
+        <w:t xml:space="preserve"> </w:t>
+      </w:r>
+      <w:r>
+        <w:t xml:space="preserve">— a false negative of</w:t>
+      </w:r>
+      <w:r>
+        <w:t xml:space="preserve"> </w:t>
+      </w:r>
+      <w:r>
+        <w:t xml:space="preserve">exactly the shape §11.4.201(11) names. Do not reintroduce an import-based</w:t>
+      </w:r>
+      <w:r>
+        <w:t xml:space="preserve"> </w:t>
+      </w:r>
+      <w:r>
+        <w:t xml:space="preserve">probe for a CLI-invoked tool.</w:t>
+      </w:r>
+    </w:p>
+    <w:bookmarkEnd w:id="24"/>
+    <w:bookmarkStart w:id="25" w:name="X00dbfa4b3b89e64c71d4e409204261ff8ef0921"/>
+    <w:p>
+      <w:pPr>
+        <w:pStyle w:val="Heading3"/>
+      </w:pPr>
+      <w:r>
+        <w:t xml:space="preserve">The python-markdown interpreter is resolved by trying the import</w:t>
+      </w:r>
+    </w:p>
+    <w:p>
+      <w:pPr>
+        <w:pStyle w:val="FirstParagraph"/>
+      </w:pPr>
+      <w:r>
+        <w:rPr>
+          <w:rStyle w:val="VerbatimChar"/>
+        </w:rPr>
+        <w:t xml:space="preserve">PY_MD</w:t>
+      </w:r>
+      <w:r>
+        <w:t xml:space="preserve"> </w:t>
+      </w:r>
+      <w:r>
+        <w:t xml:space="preserve">is chosen by actually attempting</w:t>
+      </w:r>
+      <w:r>
+        <w:t xml:space="preserve"> </w:t>
+      </w:r>
+      <w:r>
+        <w:rPr>
+          <w:rStyle w:val="VerbatimChar"/>
+        </w:rPr>
+        <w:t xml:space="preserve">import markdown</w:t>
+      </w:r>
+      <w:r>
+        <w:t xml:space="preserve"> </w:t>
+      </w:r>
+      <w:r>
+        <w:t xml:space="preserve">against, in order:</w:t>
+      </w:r>
+      <w:r>
+        <w:t xml:space="preserve"> </w:t>
+      </w:r>
+      <w:r>
+        <w:rPr>
+          <w:rStyle w:val="VerbatimChar"/>
+        </w:rPr>
+        <w:t xml:space="preserve">$BOBA_EXPORT_PYTHON</w:t>
+      </w:r>
+      <w:r>
+        <w:t xml:space="preserve">, the repo’s</w:t>
+      </w:r>
+      <w:r>
+        <w:t xml:space="preserve"> </w:t>
+      </w:r>
+      <w:r>
+        <w:rPr>
+          <w:rStyle w:val="VerbatimChar"/>
+        </w:rPr>
+        <w:t xml:space="preserve">.venv/bin/python</w:t>
+      </w:r>
+      <w:r>
+        <w:t xml:space="preserve">, then</w:t>
+      </w:r>
+      <w:r>
+        <w:t xml:space="preserve"> </w:t>
+      </w:r>
+      <w:r>
+        <w:rPr>
+          <w:rStyle w:val="VerbatimChar"/>
+        </w:rPr>
+        <w:t xml:space="preserve">python3</w:t>
+      </w:r>
+      <w:r>
+        <w:t xml:space="preserve">. It is</w:t>
+      </w:r>
+      <w:r>
+        <w:t xml:space="preserve"> </w:t>
+      </w:r>
+      <w:r>
+        <w:t xml:space="preserve">never assumed from a path’s existence (§11.4.6). Probing only system</w:t>
+      </w:r>
+      <w:r>
+        <w:t xml:space="preserve"> </w:t>
+      </w:r>
+      <w:r>
+        <w:rPr>
+          <w:rStyle w:val="VerbatimChar"/>
+        </w:rPr>
+        <w:t xml:space="preserve">python3</w:t>
+      </w:r>
+      <w:r>
+        <w:t xml:space="preserve"> </w:t>
+      </w:r>
+      <w:r>
+        <w:t xml:space="preserve">is insufficient here: this host’s</w:t>
+      </w:r>
+      <w:r>
+        <w:t xml:space="preserve"> </w:t>
+      </w:r>
+      <w:r>
+        <w:rPr>
+          <w:rStyle w:val="VerbatimChar"/>
+        </w:rPr>
+        <w:t xml:space="preserve">/usr/bin/python3</w:t>
+      </w:r>
+      <w:r>
+        <w:t xml:space="preserve"> </w:t>
+      </w:r>
+      <w:r>
+        <w:t xml:space="preserve">has no</w:t>
+      </w:r>
+      <w:r>
+        <w:t xml:space="preserve"> </w:t>
+      </w:r>
+      <w:r>
+        <w:rPr>
+          <w:rStyle w:val="VerbatimChar"/>
+        </w:rPr>
+        <w:t xml:space="preserve">pip</w:t>
+      </w:r>
+      <w:r>
+        <w:t xml:space="preserve"> </w:t>
+      </w:r>
+      <w:r>
+        <w:t xml:space="preserve">and is PEP-668</w:t>
+      </w:r>
+      <w:r>
+        <w:t xml:space="preserve"> </w:t>
+      </w:r>
+      <w:r>
+        <w:rPr>
+          <w:rStyle w:val="VerbatimChar"/>
+        </w:rPr>
+        <w:t xml:space="preserve">EXTERNALLY-MANAGED</w:t>
+      </w:r>
+      <w:r>
+        <w:t xml:space="preserve">, so</w:t>
+      </w:r>
+      <w:r>
+        <w:t xml:space="preserve"> </w:t>
+      </w:r>
+      <w:r>
+        <w:rPr>
+          <w:rStyle w:val="VerbatimChar"/>
+        </w:rPr>
+        <w:t xml:space="preserve">markdown</w:t>
+      </w:r>
+      <w:r>
+        <w:t xml:space="preserve"> </w:t>
+      </w:r>
+      <w:r>
+        <w:t xml:space="preserve">cannot live there without</w:t>
+      </w:r>
+      <w:r>
+        <w:t xml:space="preserve"> </w:t>
+      </w:r>
+      <w:r>
+        <w:t xml:space="preserve">root — while the repo</w:t>
+      </w:r>
+      <w:r>
+        <w:t xml:space="preserve"> </w:t>
+      </w:r>
+      <w:r>
+        <w:rPr>
+          <w:rStyle w:val="VerbatimChar"/>
+        </w:rPr>
+        <w:t xml:space="preserve">.venv</w:t>
+      </w:r>
+      <w:r>
+        <w:t xml:space="preserve"> </w:t>
+      </w:r>
+      <w:r>
+        <w:t xml:space="preserve">holds it with no privilege at all.</w:t>
+      </w:r>
+    </w:p>
+    <w:bookmarkEnd w:id="25"/>
+    <w:bookmarkStart w:id="26" w:name="encoding-is-pinned-on-both-legs"/>
+    <w:p>
+      <w:pPr>
+        <w:pStyle w:val="Heading3"/>
+      </w:pPr>
+      <w:r>
+        <w:t xml:space="preserve">Encoding is pinned on both legs</w:t>
+      </w:r>
+    </w:p>
+    <w:p>
+      <w:pPr>
+        <w:pStyle w:val="FirstParagraph"/>
+      </w:pPr>
+      <w:r>
+        <w:t xml:space="preserve">The corpus carries Cyrillic (</w:t>
+      </w:r>
+      <w:r>
+        <w:rPr>
+          <w:rStyle w:val="VerbatimChar"/>
+        </w:rPr>
+        <w:t xml:space="preserve">Боба</w:t>
+      </w:r>
+      <w:r>
+        <w:t xml:space="preserve">) and</w:t>
+      </w:r>
+      <w:r>
+        <w:t xml:space="preserve"> </w:t>
+      </w:r>
+      <w:r>
+        <w:rPr>
+          <w:rStyle w:val="VerbatimChar"/>
+        </w:rPr>
+        <w:t xml:space="preserve">§</w:t>
+      </w:r>
+      <w:r>
+        <w:t xml:space="preserve">. The python-markdown leg opens</w:t>
+      </w:r>
+      <w:r>
+        <w:t xml:space="preserve"> </w:t>
+      </w:r>
+      <w:r>
+        <w:t xml:space="preserve">and writes with an explicit</w:t>
+      </w:r>
+      <w:r>
+        <w:t xml:space="preserve"> </w:t>
+      </w:r>
+      <w:r>
+        <w:rPr>
+          <w:rStyle w:val="VerbatimChar"/>
+        </w:rPr>
+        <w:t xml:space="preserve">encoding='utf-8'</w:t>
+      </w:r>
+      <w:r>
+        <w:t xml:space="preserve"> </w:t>
+      </w:r>
+      <w:r>
+        <w:t xml:space="preserve">rather than inheriting the</w:t>
+      </w:r>
+      <w:r>
+        <w:t xml:space="preserve"> </w:t>
+      </w:r>
+      <w:r>
+        <w:t xml:space="preserve">ambient locale, so a</w:t>
+      </w:r>
+      <w:r>
+        <w:t xml:space="preserve"> </w:t>
+      </w:r>
+      <w:r>
+        <w:rPr>
+          <w:rStyle w:val="VerbatimChar"/>
+        </w:rPr>
+        <w:t xml:space="preserve">C</w:t>
+      </w:r>
+      <w:r>
+        <w:t xml:space="preserve">/</w:t>
+      </w:r>
+      <w:r>
+        <w:rPr>
+          <w:rStyle w:val="VerbatimChar"/>
+        </w:rPr>
+        <w:t xml:space="preserve">POSIX</w:t>
+      </w:r>
+      <w:r>
+        <w:t xml:space="preserve"> </w:t>
+      </w:r>
+      <w:r>
+        <w:t xml:space="preserve">locale cannot mangle the read and leave the</w:t>
+      </w:r>
+      <w:r>
+        <w:t xml:space="preserve"> </w:t>
+      </w:r>
+      <w:r>
+        <w:t xml:space="preserve">emitted</w:t>
+      </w:r>
+      <w:r>
+        <w:t xml:space="preserve"> </w:t>
+      </w:r>
+      <w:r>
+        <w:rPr>
+          <w:rStyle w:val="VerbatimChar"/>
+        </w:rPr>
+        <w:t xml:space="preserve">&lt;meta charset="utf-8"&gt;</w:t>
+      </w:r>
+      <w:r>
+        <w:t xml:space="preserve"> </w:t>
+      </w:r>
+      <w:r>
+        <w:t xml:space="preserve">advertising a lie.</w:t>
+      </w:r>
+    </w:p>
+    <w:bookmarkEnd w:id="26"/>
+    <w:bookmarkEnd w:id="27"/>
+    <w:bookmarkStart w:id="28" w:name="verifying-the-output"/>
+    <w:p>
+      <w:pPr>
+        <w:pStyle w:val="Heading2"/>
+      </w:pPr>
+      <w:r>
+        <w:t xml:space="preserve">Verifying the output</w:t>
+      </w:r>
+    </w:p>
+    <w:p>
+      <w:pPr>
+        <w:pStyle w:val="SourceCode"/>
+      </w:pPr>
+      <w:r>
+        <w:rPr>
+          <w:rStyle w:val="CommentTok"/>
+        </w:rPr>
+        <w:t xml:space="preserve"># charset declared on every generated export (ratcheted gate)</w:t>
+      </w:r>
+      <w:r>
+        <w:br/>
+      </w:r>
+      <w:r>
+        <w:rPr>
+          <w:rStyle w:val="FunctionTok"/>
+        </w:rPr>
+        <w:t xml:space="preserve">bash</w:t>
+      </w:r>
+      <w:r>
+        <w:rPr>
+          <w:rStyle w:val="NormalTok"/>
+        </w:rPr>
+        <w:t xml:space="preserve"> scripts/pre_build/check_cm_export_charset_valid.sh</w:t>
+      </w:r>
+      <w:r>
+        <w:br/>
+      </w:r>
+      <w:r>
+        <w:br/>
+      </w:r>
+      <w:r>
+        <w:rPr>
+          <w:rStyle w:val="CommentTok"/>
+        </w:rPr>
+        <w:t xml:space="preserve"># the PDF text layer really preserves non-ASCII</w:t>
+      </w:r>
+      <w:r>
+        <w:br/>
+      </w:r>
+      <w:r>
+        <w:rPr>
+          <w:rStyle w:val="FunctionTok"/>
+        </w:rPr>
+        <w:t xml:space="preserve">bash</w:t>
+      </w:r>
+      <w:r>
+        <w:rPr>
+          <w:rStyle w:val="NormalTok"/>
+        </w:rPr>
+        <w:t xml:space="preserve"> tests/unit/test_export_pdf_charset_integrity.sh</w:t>
+      </w:r>
+      <w:r>
+        <w:br/>
+      </w:r>
+      <w:r>
+        <w:br/>
+      </w:r>
+      <w:r>
+        <w:rPr>
+          <w:rStyle w:val="CommentTok"/>
+        </w:rPr>
+        <w:t xml:space="preserve"># DOCX shape + idempotency</w:t>
+      </w:r>
+      <w:r>
+        <w:br/>
+      </w:r>
+      <w:r>
+        <w:rPr>
+          <w:rStyle w:val="FunctionTok"/>
+        </w:rPr>
+        <w:t xml:space="preserve">bash</w:t>
+      </w:r>
+      <w:r>
+        <w:rPr>
+          <w:rStyle w:val="NormalTok"/>
+        </w:rPr>
+        <w:t xml:space="preserve"> tests/unit/test_docx_export.sh</w:t>
+      </w:r>
+      <w:r>
+        <w:br/>
+      </w:r>
+      <w:r>
+        <w:br/>
+      </w:r>
+      <w:r>
+        <w:rPr>
+          <w:rStyle w:val="CommentTok"/>
+        </w:rPr>
+        <w:t xml:space="preserve"># checkout-order touch rewrites nothing; content edit / missing twin /</w:t>
+      </w:r>
+      <w:r>
+        <w:br/>
+      </w:r>
+      <w:r>
+        <w:rPr>
+          <w:rStyle w:val="CommentTok"/>
+        </w:rPr>
+        <w:t xml:space="preserve"># charset fragment still regenerate; docx + pdf byte-stable</w:t>
+      </w:r>
+      <w:r>
+        <w:br/>
+      </w:r>
+      <w:r>
+        <w:rPr>
+          <w:rStyle w:val="FunctionTok"/>
+        </w:rPr>
+        <w:t xml:space="preserve">bash</w:t>
+      </w:r>
+      <w:r>
+        <w:rPr>
+          <w:rStyle w:val="NormalTok"/>
+        </w:rPr>
+        <w:t xml:space="preserve"> tests/unit/test_generate_markdown_exports_content_staleness.sh</w:t>
+      </w:r>
+      <w:r>
+        <w:br/>
+      </w:r>
+      <w:r>
+        <w:br/>
+      </w:r>
+      <w:r>
+        <w:rPr>
+          <w:rStyle w:val="CommentTok"/>
+        </w:rPr>
+        <w:t xml:space="preserve"># the shared staleness oracle (incl. .docx history)</w:t>
+      </w:r>
+      <w:r>
+        <w:br/>
+      </w:r>
+      <w:r>
+        <w:rPr>
+          <w:rStyle w:val="FunctionTok"/>
+        </w:rPr>
+        <w:t xml:space="preserve">bash</w:t>
+      </w:r>
+      <w:r>
+        <w:rPr>
+          <w:rStyle w:val="NormalTok"/>
+        </w:rPr>
+        <w:t xml:space="preserve"> tests/unit/test_export_staleness_oracle.sh</w:t>
+      </w:r>
+      <w:r>
+        <w:br/>
+      </w:r>
+      <w:r>
+        <w:br/>
+      </w:r>
+      <w:r>
+        <w:rPr>
+          <w:rStyle w:val="CommentTok"/>
+        </w:rPr>
+        <w:t xml:space="preserve"># M1 convergence after a whitespace-only commit, M3 corrupt-twin healing with a</w:t>
+      </w:r>
+      <w:r>
+        <w:br/>
+      </w:r>
+      <w:r>
+        <w:rPr>
+          <w:rStyle w:val="CommentTok"/>
+        </w:rPr>
+        <w:t xml:space="preserve"># valid-twin control, M4 loud non-fatal HTML failure, plus the (a) content</w:t>
+      </w:r>
+      <w:r>
+        <w:br/>
+      </w:r>
+      <w:r>
+        <w:rPr>
+          <w:rStyle w:val="CommentTok"/>
+        </w:rPr>
+        <w:t xml:space="preserve"># change / (b) missing twin / (c) charset fragment regeneration controls</w:t>
+      </w:r>
+      <w:r>
+        <w:br/>
+      </w:r>
+      <w:r>
+        <w:rPr>
+          <w:rStyle w:val="FunctionTok"/>
+        </w:rPr>
+        <w:t xml:space="preserve">bash</w:t>
+      </w:r>
+      <w:r>
+        <w:rPr>
+          <w:rStyle w:val="NormalTok"/>
+        </w:rPr>
+        <w:t xml:space="preserve"> tests/unit/test_generate_markdown_exports_review_followups.sh</w:t>
+      </w:r>
+      <w:r>
+        <w:br/>
+      </w:r>
+      <w:r>
+        <w:br/>
+      </w:r>
+      <w:r>
+        <w:rPr>
+          <w:rStyle w:val="CommentTok"/>
+        </w:rPr>
+        <w:t xml:space="preserve"># I1 docs_chain engine byte parity (real engine verify when built), M-a YAML</w:t>
+      </w:r>
+      <w:r>
+        <w:br/>
+      </w:r>
+      <w:r>
+        <w:rPr>
+          <w:rStyle w:val="CommentTok"/>
+        </w:rPr>
+        <w:t xml:space="preserve"># header-includes kept, M-b atomic same-directory install keeping the mode</w:t>
+      </w:r>
+      <w:r>
+        <w:br/>
+      </w:r>
+      <w:r>
+        <w:rPr>
+          <w:rStyle w:val="FunctionTok"/>
+        </w:rPr>
+        <w:t xml:space="preserve">bash</w:t>
+      </w:r>
+      <w:r>
+        <w:rPr>
+          <w:rStyle w:val="NormalTok"/>
+        </w:rPr>
+        <w:t xml:space="preserve"> tests/unit/test_generate_markdown_exports_engine_parity.sh</w:t>
+      </w:r>
+    </w:p>
+    <w:p>
+      <w:pPr>
+        <w:pStyle w:val="FirstParagraph"/>
+      </w:pPr>
+      <w:r>
+        <w:t xml:space="preserve">When checking a heading survived into the HTML, match against a</w:t>
+      </w:r>
+      <w:r>
+        <w:t xml:space="preserve"> </w:t>
+      </w:r>
+      <w:r>
+        <w:rPr>
+          <w:b/>
+          <w:bCs/>
+        </w:rPr>
+        <w:t xml:space="preserve">whitespace-normalized</w:t>
+      </w:r>
+      <w:r>
+        <w:t xml:space="preserve"> </w:t>
+      </w:r>
+      <w:r>
+        <w:t xml:space="preserve">stream, not lines: pandoc hard-wraps its HTML at</w:t>
+      </w:r>
+      <w:r>
+        <w:t xml:space="preserve"> </w:t>
+      </w:r>
+      <w:r>
+        <w:t xml:space="preserve">~72 columns, so a heading routinely spans a newline and a line-oriented</w:t>
+      </w:r>
+      <w:r>
+        <w:t xml:space="preserve"> </w:t>
+      </w:r>
+      <w:r>
+        <w:rPr>
+          <w:rStyle w:val="VerbatimChar"/>
+        </w:rPr>
+        <w:t xml:space="preserve">grep -F</w:t>
+      </w:r>
+      <w:r>
+        <w:t xml:space="preserve"> </w:t>
+      </w:r>
+      <w:r>
+        <w:t xml:space="preserve">returns a confident, wrong zero (§11.4.201(7)(c)). Remember also</w:t>
+      </w:r>
+      <w:r>
+        <w:t xml:space="preserve"> </w:t>
+      </w:r>
+      <w:r>
+        <w:t xml:space="preserve">that</w:t>
+      </w:r>
+      <w:r>
+        <w:t xml:space="preserve"> </w:t>
+      </w:r>
+      <w:r>
+        <w:rPr>
+          <w:rStyle w:val="VerbatimChar"/>
+        </w:rPr>
+        <w:t xml:space="preserve">&amp;</w:t>
+      </w:r>
+      <w:r>
+        <w:t xml:space="preserve"> </w:t>
+      </w:r>
+      <w:r>
+        <w:t xml:space="preserve">is correctly emitted as</w:t>
+      </w:r>
+      <w:r>
+        <w:t xml:space="preserve"> </w:t>
+      </w:r>
+      <w:r>
+        <w:rPr>
+          <w:rStyle w:val="VerbatimChar"/>
+        </w:rPr>
+        <w:t xml:space="preserve">&amp;amp;</w:t>
+      </w:r>
+      <w:r>
+        <w:t xml:space="preserve">.</w:t>
+      </w:r>
+    </w:p>
+    <w:bookmarkEnd w:id="28"/>
+    <w:bookmarkStart w:id="29" w:name="related-scripts"/>
+    <w:p>
+      <w:pPr>
+        <w:pStyle w:val="Heading2"/>
+      </w:pPr>
+      <w:r>
+        <w:t xml:space="preserve">Related scripts</w:t>
       </w:r>
     </w:p>
     <w:p>
@@ -2936,26 +4762,26 @@
         <w:pStyle w:val="Compact"/>
         <w:numPr>
           <w:ilvl w:val="0"/>
-          <w:numId w:val="1003"/>
+          <w:numId w:val="1004"/>
         </w:numPr>
       </w:pPr>
       <w:r>
         <w:rPr>
           <w:rStyle w:val="VerbatimChar"/>
         </w:rPr>
-        <w:t xml:space="preserve">scripts/lib/export_staleness.sh</w:t>
-      </w:r>
-      <w:r>
-        <w:t xml:space="preserve"> </w:t>
-      </w:r>
-      <w:r>
-        <w:t xml:space="preserve">— the staleness oracle shared by this</w:t>
-      </w:r>
-      <w:r>
-        <w:t xml:space="preserve"> </w:t>
-      </w:r>
-      <w:r>
-        <w:t xml:space="preserve">script and the pre-build gate.</w:t>
+        <w:t xml:space="preserve">scripts/pre_build/check_cm_export_charset_valid.sh</w:t>
+      </w:r>
+      <w:r>
+        <w:t xml:space="preserve"> </w:t>
+      </w:r>
+      <w:r>
+        <w:t xml:space="preserve">— the gate over this</w:t>
+      </w:r>
+      <w:r>
+        <w:t xml:space="preserve"> </w:t>
+      </w:r>
+      <w:r>
+        <w:t xml:space="preserve">script’s output; reads a monotone-decreasing ratchet baseline.</w:t>
       </w:r>
     </w:p>
     <w:p>
@@ -2963,7 +4789,61 @@
         <w:pStyle w:val="Compact"/>
         <w:numPr>
           <w:ilvl w:val="0"/>
-          <w:numId w:val="1003"/>
+          <w:numId w:val="1004"/>
+        </w:numPr>
+      </w:pPr>
+      <w:r>
+        <w:rPr>
+          <w:rStyle w:val="VerbatimChar"/>
+        </w:rPr>
+        <w:t xml:space="preserve">scripts/regenerate-continuation-exports.sh</w:t>
+      </w:r>
+      <w:r>
+        <w:t xml:space="preserve"> </w:t>
+      </w:r>
+      <w:r>
+        <w:t xml:space="preserve">— deliberately narrow</w:t>
+      </w:r>
+      <w:r>
+        <w:t xml:space="preserve"> </w:t>
+      </w:r>
+      <w:r>
+        <w:t xml:space="preserve">CONTINUATION-only regen; see its own guide for why it does not call this.</w:t>
+      </w:r>
+    </w:p>
+    <w:p>
+      <w:pPr>
+        <w:pStyle w:val="Compact"/>
+        <w:numPr>
+          <w:ilvl w:val="0"/>
+          <w:numId w:val="1004"/>
+        </w:numPr>
+      </w:pPr>
+      <w:r>
+        <w:rPr>
+          <w:rStyle w:val="VerbatimChar"/>
+        </w:rPr>
+        <w:t xml:space="preserve">scripts/lib/export_staleness.sh</w:t>
+      </w:r>
+      <w:r>
+        <w:t xml:space="preserve"> </w:t>
+      </w:r>
+      <w:r>
+        <w:t xml:space="preserve">— the staleness oracle shared by this</w:t>
+      </w:r>
+      <w:r>
+        <w:t xml:space="preserve"> </w:t>
+      </w:r>
+      <w:r>
+        <w:t xml:space="preserve">script and the pre-build gate.</w:t>
+      </w:r>
+    </w:p>
+    <w:p>
+      <w:pPr>
+        <w:pStyle w:val="Compact"/>
+        <w:numPr>
+          <w:ilvl w:val="0"/>
+          <w:numId w:val="1004"/>
         </w:numPr>
       </w:pPr>
       <w:r>
@@ -3050,9 +4930,48 @@
       <w:r>
         <w:t xml:space="preserve">DOCX, PDF charset-integrity and path-argument guards all PASS.</w:t>
       </w:r>
-    </w:p>
-    <w:bookmarkEnd w:id="25"/>
-    <w:bookmarkEnd w:id="26"/>
+      <w:r>
+        <w:t xml:space="preserve"> </w:t>
+      </w:r>
+      <w:r>
+        <w:t xml:space="preserve">Re-verified after the review follow-ups (M1/M3/M4): explicit-scope run over</w:t>
+      </w:r>
+      <w:r>
+        <w:t xml:space="preserve"> </w:t>
+      </w:r>
+      <w:r>
+        <w:t xml:space="preserve">all 464 in-scope sources of a fresh clone rewrote 0 twins (content and</w:t>
+      </w:r>
+      <w:r>
+        <w:t xml:space="preserve"> </w:t>
+      </w:r>
+      <w:r>
+        <w:t xml:space="preserve">mtime); a corrupted</w:t>
+      </w:r>
+      <w:r>
+        <w:t xml:space="preserve"> </w:t>
+      </w:r>
+      <w:r>
+        <w:rPr>
+          <w:rStyle w:val="VerbatimChar"/>
+        </w:rPr>
+        <w:t xml:space="preserve">.docx</w:t>
+      </w:r>
+      <w:r>
+        <w:t xml:space="preserve"> </w:t>
+      </w:r>
+      <w:r>
+        <w:t xml:space="preserve">planted as a needle was the only one regenerated;</w:t>
+      </w:r>
+      <w:r>
+        <w:t xml:space="preserve"> </w:t>
+      </w:r>
+      <w:r>
+        <w:t xml:space="preserve">the follow-up suite passes 18/18 (11 of its assertions failed before).</w:t>
+      </w:r>
+    </w:p>
+    <w:bookmarkEnd w:id="29"/>
+    <w:bookmarkEnd w:id="30"/>
     <w:sectPr>
       <w:footnotePr>
         <w:numRestart w:val="eachSect"/>
@@ -3266,6 +5185,91 @@
       </w:rPr>
     </w:lvl>
   </w:abstractNum>
+  <w:abstractNum w:abstractNumId="99411">
+    <w:nsid w:val="00A99411"/>
+    <w:multiLevelType w:val="multilevel"/>
+    <w:lvl w:ilvl="0">
+      <w:start w:val="1"/>
+      <w:numFmt w:val="decimal"/>
+      <w:lvlText w:val="%1."/>
+      <w:lvlJc w:val="left"/>
+      <w:pPr>
+        <w:ind w:left="720" w:hanging="360"/>
+      </w:pPr>
+    </w:lvl>
+    <w:lvl w:ilvl="1">
+      <w:start w:val="1"/>
+      <w:numFmt w:val="decimal"/>
+      <w:lvlText w:val="%2."/>
+      <w:lvlJc w:val="left"/>
+      <w:pPr>
+        <w:ind w:left="1440" w:hanging="360"/>
+      </w:pPr>
+    </w:lvl>
+    <w:lvl w:ilvl="2">
+      <w:start w:val="1"/>
+      <w:numFmt w:val="decimal"/>
+      <w:lvlText w:val="%3."/>
+      <w:lvlJc w:val="left"/>
+      <w:pPr>
+        <w:ind w:left="2160" w:hanging="360"/>
+      </w:pPr>
+    </w:lvl>
+    <w:lvl w:ilvl="3">
+      <w:start w:val="1"/>
+      <w:numFmt w:val="decimal"/>
+      <w:lvlText w:val="%4."/>
+      <w:lvlJc w:val="left"/>
+      <w:pPr>
+        <w:ind w:left="2880" w:hanging="360"/>
+      </w:pPr>
+    </w:lvl>
+    <w:lvl w:ilvl="4">
+      <w:start w:val="1"/>
+      <w:numFmt w:val="decimal"/>
+      <w:lvlText w:val="%5."/>
+      <w:lvlJc w:val="left"/>
+      <w:pPr>
+        <w:ind w:left="3600" w:hanging="360"/>
+      </w:pPr>
+    </w:lvl>
+    <w:lvl w:ilvl="5">
+      <w:start w:val="1"/>
+      <w:numFmt w:val="decimal"/>
+      <w:lvlText w:val="%6."/>
+      <w:lvlJc w:val="left"/>
+      <w:pPr>
+        <w:ind w:left="4320" w:hanging="360"/>
+      </w:pPr>
+    </w:lvl>
+    <w:lvl w:ilvl="6">
+      <w:start w:val="1"/>
+      <w:numFmt w:val="decimal"/>
+      <w:lvlText w:val="%7."/>
+      <w:lvlJc w:val="left"/>
+      <w:pPr>
+        <w:ind w:left="5040" w:hanging="360"/>
+      </w:pPr>
+    </w:lvl>
+    <w:lvl w:ilvl="7">
+      <w:start w:val="1"/>
+      <w:numFmt w:val="decimal"/>
+      <w:lvlText w:val="%8."/>
+      <w:lvlJc w:val="left"/>
+      <w:pPr>
+        <w:ind w:left="5760" w:hanging="360"/>
+      </w:pPr>
+    </w:lvl>
+    <w:lvl w:ilvl="8">
+      <w:start w:val="1"/>
+      <w:numFmt w:val="decimal"/>
+      <w:lvlText w:val="%9."/>
+      <w:lvlJc w:val="left"/>
+      <w:pPr>
+        <w:ind w:left="6480" w:hanging="360"/>
+      </w:pPr>
+    </w:lvl>
+  </w:abstractNum>
   <w:num w:numId="1000">
     <w:abstractNumId w:val="990"/>
   </w:num>
@@ -3276,6 +5280,36 @@
     <w:abstractNumId w:val="991"/>
   </w:num>
   <w:num w:numId="1003">
+    <w:abstractNumId w:val="99411"/>
+    <w:lvlOverride w:ilvl="0">
+      <w:startOverride w:val="1"/>
+    </w:lvlOverride>
+    <w:lvlOverride w:ilvl="1">
+      <w:startOverride w:val="1"/>
+    </w:lvlOverride>
+    <w:lvlOverride w:ilvl="2">
+      <w:startOverride w:val="1"/>
+    </w:lvlOverride>
+    <w:lvlOverride w:ilvl="3">
+      <w:startOverride w:val="1"/>
+    </w:lvlOverride>
+    <w:lvlOverride w:ilvl="4">
+      <w:startOverride w:val="1"/>
+    </w:lvlOverride>
+    <w:lvlOverride w:ilvl="5">
+      <w:startOverride w:val="1"/>
+    </w:lvlOverride>
+    <w:lvlOverride w:ilvl="6">
+      <w:startOverride w:val="1"/>
+    </w:lvlOverride>
+    <w:lvlOverride w:ilvl="7">
+      <w:startOverride w:val="1"/>
+    </w:lvlOverride>
+    <w:lvlOverride w:ilvl="8">
+      <w:startOverride w:val="1"/>
+    </w:lvlOverride>
+  </w:num>
+  <w:num w:numId="1004">
     <w:abstractNumId w:val="991"/>
   </w:num>
 </w:numbering>

</xml_diff>